<commit_message>
More changes before demo
</commit_message>
<xml_diff>
--- a/docassemble/PetitionForProtectiveOrderEfilingDemo/data/templates/protective_order_petition_next_steps.docx
+++ b/docassemble/PetitionForProtectiveOrderEfilingDemo/data/templates/protective_order_petition_next_steps.docx
@@ -1,13 +1,34 @@
 
 <file path=word/document.xml><?xml version="1.0" encoding="utf-8"?>
-<w:document xmlns:wpc="http://schemas.microsoft.com/office/word/2010/wordprocessingCanvas" xmlns:cx="http://schemas.microsoft.com/office/drawing/2014/chartex" xmlns:cx1="http://schemas.microsoft.com/office/drawing/2015/9/8/chartex" xmlns:cx2="http://schemas.microsoft.com/office/drawing/2015/10/21/chartex" xmlns:cx3="http://schemas.microsoft.com/office/drawing/2016/5/9/chartex" xmlns:cx4="http://schemas.microsoft.com/office/drawing/2016/5/10/chartex" xmlns:cx5="http://schemas.microsoft.com/office/drawing/2016/5/11/chartex" xmlns:cx6="http://schemas.microsoft.com/office/drawing/2016/5/12/chartex" xmlns:cx7="http://schemas.microsoft.com/office/drawing/2016/5/13/chartex" xmlns:cx8="http://schemas.microsoft.com/office/drawing/2016/5/14/chartex" xmlns:mc="http://schemas.openxmlformats.org/markup-compatibility/2006" xmlns:aink="http://schemas.microsoft.com/office/drawing/2016/ink" xmlns:am3d="http://schemas.microsoft.com/office/drawing/2017/model3d" xmlns:o="urn:schemas-microsoft-com:office:office" xmlns:r="http://schemas.openxmlformats.org/officeDocument/2006/relationships" xmlns:m="http://schemas.openxmlformats.org/officeDocument/2006/math" xmlns:v="urn:schemas-microsoft-com:vml" xmlns:wp14="http://schemas.microsoft.com/office/word/2010/wordprocessingDrawing" xmlns:wp="http://schemas.openxmlformats.org/drawingml/2006/wordprocessingDrawing" xmlns:w10="urn:schemas-microsoft-com:office:word" xmlns:w="http://schemas.openxmlformats.org/wordprocessingml/2006/main" xmlns:w14="http://schemas.microsoft.com/office/word/2010/wordml" xmlns:w15="http://schemas.microsoft.com/office/word/2012/wordml" xmlns:w16cex="http://schemas.microsoft.com/office/word/2018/wordml/cex" xmlns:w16cid="http://schemas.microsoft.com/office/word/2016/wordml/cid" xmlns:w16="http://schemas.microsoft.com/office/word/2018/wordml" xmlns:w16sdtdh="http://schemas.microsoft.com/office/word/2020/wordml/sdtdatahash" xmlns:w16se="http://schemas.microsoft.com/office/word/2015/wordml/symex" xmlns:wpg="http://schemas.microsoft.com/office/word/2010/wordprocessingGroup" xmlns:wpi="http://schemas.microsoft.com/office/word/2010/wordprocessingInk" xmlns:wne="http://schemas.microsoft.com/office/word/2006/wordml" xmlns:wps="http://schemas.microsoft.com/office/word/2010/wordprocessingShape" mc:Ignorable="w14 w15 w16se w16cid w16 w16cex w16sdtdh wp14">
+<w:document xmlns:wpc="http://schemas.microsoft.com/office/word/2010/wordprocessingCanvas" xmlns:cx="http://schemas.microsoft.com/office/drawing/2014/chartex" xmlns:cx1="http://schemas.microsoft.com/office/drawing/2015/9/8/chartex" xmlns:cx2="http://schemas.microsoft.com/office/drawing/2015/10/21/chartex" xmlns:cx3="http://schemas.microsoft.com/office/drawing/2016/5/9/chartex" xmlns:cx4="http://schemas.microsoft.com/office/drawing/2016/5/10/chartex" xmlns:cx5="http://schemas.microsoft.com/office/drawing/2016/5/11/chartex" xmlns:cx6="http://schemas.microsoft.com/office/drawing/2016/5/12/chartex" xmlns:cx7="http://schemas.microsoft.com/office/drawing/2016/5/13/chartex" xmlns:cx8="http://schemas.microsoft.com/office/drawing/2016/5/14/chartex" xmlns:mc="http://schemas.openxmlformats.org/markup-compatibility/2006" xmlns:m="http://schemas.openxmlformats.org/officeDocument/2006/math" xmlns:aink="http://schemas.microsoft.com/office/drawing/2016/ink" xmlns:am3d="http://schemas.microsoft.com/office/drawing/2017/model3d" xmlns:oel="http://schemas.microsoft.com/office/2019/extlst" xmlns:r="http://schemas.openxmlformats.org/officeDocument/2006/relationships" xmlns:wp14="http://schemas.microsoft.com/office/word/2010/wordprocessingDrawing" xmlns:wp="http://schemas.openxmlformats.org/drawingml/2006/wordprocessingDrawing" xmlns:wpg="http://schemas.microsoft.com/office/word/2010/wordprocessingGroup" xmlns:wpi="http://schemas.microsoft.com/office/word/2010/wordprocessingInk" xmlns:wps="http://schemas.microsoft.com/office/word/2010/wordprocessingShape" xmlns:o="urn:schemas-microsoft-com:office:office" xmlns:v="urn:schemas-microsoft-com:vml" xmlns:w10="urn:schemas-microsoft-com:office:word" xmlns:w="http://schemas.openxmlformats.org/wordprocessingml/2006/main" xmlns:w14="http://schemas.microsoft.com/office/word/2010/wordml" xmlns:w15="http://schemas.microsoft.com/office/word/2012/wordml" xmlns:w16cex="http://schemas.microsoft.com/office/word/2018/wordml/cex" xmlns:w16cid="http://schemas.microsoft.com/office/word/2016/wordml/cid" xmlns:w16="http://schemas.microsoft.com/office/word/2018/wordml" xmlns:w16sdtdh="http://schemas.microsoft.com/office/word/2020/wordml/sdtdatahash" xmlns:w16sdtfl="http://schemas.microsoft.com/office/word/2024/wordml/sdtformatlock" xmlns:w16se="http://schemas.microsoft.com/office/word/2015/wordml/symex" xmlns:w16du="http://schemas.microsoft.com/office/word/2023/wordml/word16du" xmlns:wne="http://schemas.microsoft.com/office/word/2006/wordml" mc:Ignorable="w14 w15 w16se w16cid w16 w16cex w16sdtdh w16sdtfl w16du wp14">
   <w:body>
     <w:p>
       <w:pPr>
         <w:pStyle w:val="Title1"/>
       </w:pPr>
-      <w:r>
-        <w:t>{{ al_next_steps_intro_prompt }}</w:t>
+      <w:proofErr w:type="gramStart"/>
+      <w:r>
+        <w:t xml:space="preserve">{{ </w:t>
+      </w:r>
+      <w:proofErr w:type="spellStart"/>
+      <w:r>
+        <w:t>al</w:t>
+      </w:r>
+      <w:proofErr w:type="gramEnd"/>
+      <w:r>
+        <w:t>_next_steps_intro_</w:t>
+      </w:r>
+      <w:proofErr w:type="gramStart"/>
+      <w:r>
+        <w:t>prompt</w:t>
+      </w:r>
+      <w:proofErr w:type="spellEnd"/>
+      <w:r>
+        <w:t xml:space="preserve"> }</w:t>
+      </w:r>
+      <w:proofErr w:type="gramEnd"/>
+      <w:r>
+        <w:t>}</w:t>
       </w:r>
     </w:p>
     <w:p>
@@ -24,32 +45,47 @@
       <w:r>
         <w:t xml:space="preserve">Congratulations </w:t>
       </w:r>
-      <w:r>
-        <w:t>{_{</w:t>
-      </w:r>
-      <w:r>
-        <w:t xml:space="preserve"> users </w:t>
-      </w:r>
-      <w:r>
-        <w:t>}_}</w:t>
+      <w:proofErr w:type="gramStart"/>
+      <w:r>
+        <w:t>{{</w:t>
+      </w:r>
+      <w:r>
+        <w:t xml:space="preserve"> users</w:t>
+      </w:r>
+      <w:proofErr w:type="gramEnd"/>
+      <w:r>
+        <w:t xml:space="preserve"> </w:t>
+      </w:r>
+      <w:r>
+        <w:t>}}</w:t>
       </w:r>
       <w:r>
         <w:t xml:space="preserve">! You have finished all the forms you need to </w:t>
       </w:r>
+      <w:proofErr w:type="gramStart"/>
       <w:r>
         <w:t>{{</w:t>
       </w:r>
       <w:r>
         <w:t xml:space="preserve"> </w:t>
       </w:r>
-      <w:r>
-        <w:t>al_next_s</w:t>
+      <w:proofErr w:type="spellStart"/>
+      <w:r>
+        <w:t>al</w:t>
+      </w:r>
+      <w:proofErr w:type="gramEnd"/>
+      <w:r>
+        <w:t>_next_s</w:t>
       </w:r>
       <w:r>
         <w:t>t</w:t>
       </w:r>
       <w:r>
-        <w:t>eps_intro_pr</w:t>
+        <w:t>eps_intro_</w:t>
+      </w:r>
+      <w:proofErr w:type="gramStart"/>
+      <w:r>
+        <w:t>pr</w:t>
       </w:r>
       <w:r>
         <w:t>o</w:t>
@@ -58,22 +94,59 @@
         <w:t>mp</w:t>
       </w:r>
       <w:r>
-        <w:t>t }}. The rest of the pages in this packet are y</w:t>
-      </w:r>
-      <w:r>
-        <w:t>our {{ showifd</w:t>
-      </w:r>
-      <w:r>
-        <w:t>ef("al_next_steps_document_title",</w:t>
-      </w:r>
-      <w:r>
-        <w:t>"application/petition/complaint") }}{_%</w:t>
+        <w:t>t</w:t>
+      </w:r>
+      <w:proofErr w:type="spellEnd"/>
+      <w:r>
+        <w:t xml:space="preserve"> }</w:t>
+      </w:r>
+      <w:proofErr w:type="gramEnd"/>
+      <w:r>
+        <w:t>}. The rest of the pages in this packet are y</w:t>
+      </w:r>
+      <w:r>
+        <w:t xml:space="preserve">our </w:t>
+      </w:r>
+      <w:proofErr w:type="gramStart"/>
+      <w:r>
+        <w:t>{{ showifd</w:t>
+      </w:r>
+      <w:r>
+        <w:t>ef</w:t>
+      </w:r>
+      <w:proofErr w:type="gramEnd"/>
+      <w:r>
+        <w:t>("al_next_steps_document_title",</w:t>
+      </w:r>
+      <w:r>
+        <w:t>"application/petition/complaint"</w:t>
+      </w:r>
+      <w:proofErr w:type="gramStart"/>
+      <w:r>
+        <w:t>) }}{</w:t>
+      </w:r>
+      <w:proofErr w:type="gramEnd"/>
+      <w:r>
+        <w:t>%</w:t>
       </w:r>
       <w:r>
         <w:t>if</w:t>
       </w:r>
       <w:r>
-        <w:t xml:space="preserve"> other_parties.number() %_</w:t>
+        <w:t xml:space="preserve"> </w:t>
+      </w:r>
+      <w:proofErr w:type="spellStart"/>
+      <w:r>
+        <w:t>other_</w:t>
+      </w:r>
+      <w:proofErr w:type="gramStart"/>
+      <w:r>
+        <w:t>parties.number</w:t>
+      </w:r>
+      <w:proofErr w:type="spellEnd"/>
+      <w:proofErr w:type="gramEnd"/>
+      <w:r>
+        <w:t>() %</w:t>
       </w:r>
       <w:r>
         <w:t>} in</w:t>
@@ -85,7 +158,7 @@
         <w:t xml:space="preserve"> </w:t>
       </w:r>
       <w:r>
-        <w:t>{_</w:t>
+        <w:t>{</w:t>
       </w:r>
       <w:r>
         <w:rPr>
@@ -93,6 +166,7 @@
         </w:rPr>
         <w:t>{</w:t>
       </w:r>
+      <w:proofErr w:type="gramStart"/>
       <w:r>
         <w:rPr>
           <w:b/>
@@ -103,56 +177,91 @@
         <w:rPr>
           <w:b/>
         </w:rPr>
-        <w:t>ers }_}</w:t>
-      </w:r>
+        <w:t>ers }</w:t>
+      </w:r>
+      <w:proofErr w:type="gramEnd"/>
       <w:r>
         <w:rPr>
           <w:b/>
         </w:rPr>
+        <w:t>}</w:t>
+      </w:r>
+      <w:r>
+        <w:rPr>
+          <w:b/>
+        </w:rPr>
+        <w:t xml:space="preserve"> </w:t>
+      </w:r>
+      <w:r>
+        <w:rPr>
+          <w:b/>
+        </w:rPr>
         <w:t>v</w:t>
       </w:r>
       <w:r>
         <w:rPr>
           <w:b/>
         </w:rPr>
-        <w:t>{_{</w:t>
+        <w:t xml:space="preserve"> </w:t>
       </w:r>
       <w:r>
         <w:rPr>
           <w:b/>
         </w:rPr>
+        <w:t>{{</w:t>
+      </w:r>
+      <w:proofErr w:type="spellStart"/>
+      <w:r>
+        <w:rPr>
+          <w:b/>
+        </w:rPr>
         <w:t>ot</w:t>
       </w:r>
       <w:r>
         <w:rPr>
           <w:b/>
         </w:rPr>
-        <w:t>her_parties }_}</w:t>
-      </w:r>
+        <w:t>her_</w:t>
+      </w:r>
+      <w:proofErr w:type="gramStart"/>
       <w:r>
         <w:rPr>
           <w:b/>
         </w:rPr>
-        <w:t>{_%</w:t>
+        <w:t>parties</w:t>
+      </w:r>
+      <w:proofErr w:type="spellEnd"/>
+      <w:r>
+        <w:rPr>
+          <w:b/>
+        </w:rPr>
+        <w:t xml:space="preserve"> }}</w:t>
+      </w:r>
+      <w:r>
+        <w:rPr>
+          <w:b/>
+        </w:rPr>
+        <w:t>{</w:t>
+      </w:r>
+      <w:proofErr w:type="gramEnd"/>
+      <w:r>
+        <w:rPr>
+          <w:b/>
+        </w:rPr>
+        <w:t>%</w:t>
       </w:r>
       <w:r>
         <w:t>en</w:t>
       </w:r>
       <w:r>
-        <w:t>dif %_}</w:t>
+        <w:t>dif %}</w:t>
       </w:r>
       <w:r>
         <w:t>.</w:t>
       </w:r>
     </w:p>
     <w:p>
-      <w:r>
-        <w:t>If you did not finish or you want to go back and change your answers to update your forms, use this QR code</w:t>
-      </w:r>
-      <w:r>
-        <w:br/>
-      </w:r>
-      <w:r>
+      <w:pPr>
         <w:rPr>
           <w:rFonts w:ascii="Cascadia Mono" w:hAnsi="Cascadia Mono" w:cs="Cascadia Mono"/>
           <w:color w:val="242424"/>
@@ -160,7 +269,166 @@
           <w:szCs w:val="21"/>
           <w:shd w:val="clear" w:color="auto" w:fill="FFFFFF"/>
         </w:rPr>
-        <w:t>{{ qr_code(interview_url()) }}</w:t>
+      </w:pPr>
+      <w:r>
+        <w:t xml:space="preserve">If you did not finish or </w:t>
+      </w:r>
+      <w:proofErr w:type="gramStart"/>
+      <w:r>
+        <w:t>you want</w:t>
+      </w:r>
+      <w:proofErr w:type="gramEnd"/>
+      <w:r>
+        <w:t xml:space="preserve"> to go back and change your answers to update your forms, use this QR code</w:t>
+      </w:r>
+      <w:r>
+        <w:br/>
+      </w:r>
+    </w:p>
+    <w:p>
+      <w:r>
+        <w:rPr>
+          <w:rFonts w:ascii="Cascadia Mono" w:hAnsi="Cascadia Mono" w:cs="Cascadia Mono"/>
+          <w:color w:val="242424"/>
+          <w:sz w:val="21"/>
+          <w:szCs w:val="21"/>
+          <w:shd w:val="clear" w:color="auto" w:fill="FFFFFF"/>
+        </w:rPr>
+        <w:t>{{p</w:t>
+      </w:r>
+      <w:r>
+        <w:rPr>
+          <w:rFonts w:ascii="Cascadia Mono" w:hAnsi="Cascadia Mono" w:cs="Cascadia Mono"/>
+          <w:color w:val="242424"/>
+          <w:sz w:val="21"/>
+          <w:szCs w:val="21"/>
+          <w:shd w:val="clear" w:color="auto" w:fill="FFFFFF"/>
+        </w:rPr>
+        <w:t xml:space="preserve"> </w:t>
+      </w:r>
+      <w:proofErr w:type="spellStart"/>
+      <w:r>
+        <w:rPr>
+          <w:rFonts w:ascii="Cascadia Mono" w:hAnsi="Cascadia Mono" w:cs="Cascadia Mono"/>
+          <w:color w:val="242424"/>
+          <w:sz w:val="21"/>
+          <w:szCs w:val="21"/>
+          <w:shd w:val="clear" w:color="auto" w:fill="FFFFFF"/>
+        </w:rPr>
+        <w:t>qr_code</w:t>
+      </w:r>
+      <w:proofErr w:type="spellEnd"/>
+      <w:r>
+        <w:rPr>
+          <w:rFonts w:ascii="Cascadia Mono" w:hAnsi="Cascadia Mono" w:cs="Cascadia Mono"/>
+          <w:color w:val="242424"/>
+          <w:sz w:val="21"/>
+          <w:szCs w:val="21"/>
+          <w:shd w:val="clear" w:color="auto" w:fill="FFFFFF"/>
+        </w:rPr>
+        <w:t>(</w:t>
+      </w:r>
+      <w:proofErr w:type="spellStart"/>
+      <w:r>
+        <w:rPr>
+          <w:rFonts w:ascii="Cascadia Mono" w:hAnsi="Cascadia Mono" w:cs="Cascadia Mono"/>
+          <w:color w:val="242424"/>
+          <w:sz w:val="21"/>
+          <w:szCs w:val="21"/>
+          <w:shd w:val="clear" w:color="auto" w:fill="FFFFFF"/>
+        </w:rPr>
+        <w:t>interview_url</w:t>
+      </w:r>
+      <w:proofErr w:type="spellEnd"/>
+      <w:r>
+        <w:rPr>
+          <w:rFonts w:ascii="Cascadia Mono" w:hAnsi="Cascadia Mono" w:cs="Cascadia Mono"/>
+          <w:color w:val="242424"/>
+          <w:sz w:val="21"/>
+          <w:szCs w:val="21"/>
+          <w:shd w:val="clear" w:color="auto" w:fill="FFFFFF"/>
+        </w:rPr>
+        <w:t>(</w:t>
+      </w:r>
+      <w:r>
+        <w:rPr>
+          <w:rFonts w:ascii="Cascadia Mono" w:hAnsi="Cascadia Mono" w:cs="Cascadia Mono"/>
+          <w:color w:val="242424"/>
+          <w:sz w:val="21"/>
+          <w:szCs w:val="21"/>
+          <w:shd w:val="clear" w:color="auto" w:fill="FFFFFF"/>
+        </w:rPr>
+        <w:t>), width=</w:t>
+      </w:r>
+      <w:r>
+        <w:rPr>
+          <w:rFonts w:ascii="Cascadia Mono" w:hAnsi="Cascadia Mono" w:cs="Cascadia Mono"/>
+          <w:color w:val="242424"/>
+          <w:sz w:val="21"/>
+          <w:szCs w:val="21"/>
+          <w:shd w:val="clear" w:color="auto" w:fill="FFFFFF"/>
+        </w:rPr>
+        <w:t>”</w:t>
+      </w:r>
+      <w:r>
+        <w:rPr>
+          <w:rFonts w:ascii="Cascadia Mono" w:hAnsi="Cascadia Mono" w:cs="Cascadia Mono"/>
+          <w:color w:val="242424"/>
+          <w:sz w:val="21"/>
+          <w:szCs w:val="21"/>
+          <w:shd w:val="clear" w:color="auto" w:fill="FFFFFF"/>
+        </w:rPr>
+        <w:t>200px</w:t>
+      </w:r>
+      <w:r>
+        <w:rPr>
+          <w:rFonts w:ascii="Cascadia Mono" w:hAnsi="Cascadia Mono" w:cs="Cascadia Mono"/>
+          <w:color w:val="242424"/>
+          <w:sz w:val="21"/>
+          <w:szCs w:val="21"/>
+          <w:shd w:val="clear" w:color="auto" w:fill="FFFFFF"/>
+        </w:rPr>
+        <w:t>”</w:t>
+      </w:r>
+      <w:r>
+        <w:rPr>
+          <w:rFonts w:ascii="Cascadia Mono" w:hAnsi="Cascadia Mono" w:cs="Cascadia Mono"/>
+          <w:color w:val="242424"/>
+          <w:sz w:val="21"/>
+          <w:szCs w:val="21"/>
+          <w:shd w:val="clear" w:color="auto" w:fill="FFFFFF"/>
+        </w:rPr>
+        <w:t>)</w:t>
+      </w:r>
+      <w:r>
+        <w:rPr>
+          <w:rFonts w:ascii="Cascadia Mono" w:hAnsi="Cascadia Mono" w:cs="Cascadia Mono"/>
+          <w:color w:val="242424"/>
+          <w:sz w:val="21"/>
+          <w:szCs w:val="21"/>
+          <w:shd w:val="clear" w:color="auto" w:fill="FFFFFF"/>
+        </w:rPr>
+        <w:t xml:space="preserve"> | markdown</w:t>
+      </w:r>
+      <w:r>
+        <w:rPr>
+          <w:rFonts w:ascii="Cascadia Mono" w:hAnsi="Cascadia Mono" w:cs="Cascadia Mono"/>
+          <w:color w:val="242424"/>
+          <w:sz w:val="21"/>
+          <w:szCs w:val="21"/>
+          <w:shd w:val="clear" w:color="auto" w:fill="FFFFFF"/>
+        </w:rPr>
+        <w:t xml:space="preserve"> </w:t>
+      </w:r>
+      <w:r>
+        <w:rPr>
+          <w:rFonts w:ascii="Cascadia Mono" w:hAnsi="Cascadia Mono" w:cs="Cascadia Mono"/>
+          <w:color w:val="242424"/>
+          <w:sz w:val="21"/>
+          <w:szCs w:val="21"/>
+          <w:shd w:val="clear" w:color="auto" w:fill="FFFFFF"/>
+        </w:rPr>
+        <w:t>}}</w:t>
       </w:r>
     </w:p>
     <w:p>
@@ -220,14 +488,37 @@
         </w:rPr>
         <w:t xml:space="preserve">File this </w:t>
       </w:r>
-      <w:r>
-        <w:t>{{ showifdef("</w:t>
-      </w:r>
-      <w:r>
-        <w:t>al_next_steps_document_title", "app</w:t>
-      </w:r>
-      <w:r>
-        <w:t>lication/petition/complaint") }} with th</w:t>
+      <w:proofErr w:type="gramStart"/>
+      <w:r>
+        <w:t xml:space="preserve">{{ </w:t>
+      </w:r>
+      <w:proofErr w:type="spellStart"/>
+      <w:r>
+        <w:t>showifdef</w:t>
+      </w:r>
+      <w:proofErr w:type="spellEnd"/>
+      <w:proofErr w:type="gramEnd"/>
+      <w:r>
+        <w:t>("</w:t>
+      </w:r>
+      <w:proofErr w:type="spellStart"/>
+      <w:r>
+        <w:t>al_next_steps_document_title</w:t>
+      </w:r>
+      <w:proofErr w:type="spellEnd"/>
+      <w:r>
+        <w:t>", "app</w:t>
+      </w:r>
+      <w:r>
+        <w:t>lication/petition/complaint"</w:t>
+      </w:r>
+      <w:proofErr w:type="gramStart"/>
+      <w:r>
+        <w:t>) }</w:t>
+      </w:r>
+      <w:proofErr w:type="gramEnd"/>
+      <w:r>
+        <w:t>} with th</w:t>
       </w:r>
       <w:r>
         <w:t>e court now.</w:t>
@@ -260,6 +551,7 @@
         </w:rPr>
         <w:t xml:space="preserve">Deliver a copy to </w:t>
       </w:r>
+      <w:proofErr w:type="gramStart"/>
       <w:r>
         <w:rPr>
           <w14:textOutline w14:w="9525" w14:cap="rnd" w14:cmpd="sng" w14:algn="ctr">
@@ -268,7 +560,7 @@
             <w14:bevel/>
           </w14:textOutline>
         </w:rPr>
-        <w:t>{_{</w:t>
+        <w:t>{{</w:t>
       </w:r>
       <w:r>
         <w:rPr>
@@ -278,8 +570,9 @@
             <w14:bevel/>
           </w14:textOutline>
         </w:rPr>
-        <w:t xml:space="preserve"> showifdef('other_parties[0]') </w:t>
-      </w:r>
+        <w:t xml:space="preserve"> </w:t>
+      </w:r>
+      <w:proofErr w:type="spellStart"/>
       <w:r>
         <w:rPr>
           <w14:textOutline w14:w="9525" w14:cap="rnd" w14:cmpd="sng" w14:algn="ctr">
@@ -288,7 +581,95 @@
             <w14:bevel/>
           </w14:textOutline>
         </w:rPr>
-        <w:t>}_}</w:t>
+        <w:t>showifdef</w:t>
+      </w:r>
+      <w:proofErr w:type="spellEnd"/>
+      <w:proofErr w:type="gramEnd"/>
+      <w:r>
+        <w:rPr>
+          <w14:textOutline w14:w="9525" w14:cap="rnd" w14:cmpd="sng" w14:algn="ctr">
+            <w14:noFill/>
+            <w14:prstDash w14:val="solid"/>
+            <w14:bevel/>
+          </w14:textOutline>
+        </w:rPr>
+        <w:t>('</w:t>
+      </w:r>
+      <w:proofErr w:type="spellStart"/>
+      <w:r>
+        <w:rPr>
+          <w14:textOutline w14:w="9525" w14:cap="rnd" w14:cmpd="sng" w14:algn="ctr">
+            <w14:noFill/>
+            <w14:prstDash w14:val="solid"/>
+            <w14:bevel/>
+          </w14:textOutline>
+        </w:rPr>
+        <w:t>other_</w:t>
+      </w:r>
+      <w:proofErr w:type="gramStart"/>
+      <w:r>
+        <w:rPr>
+          <w14:textOutline w14:w="9525" w14:cap="rnd" w14:cmpd="sng" w14:algn="ctr">
+            <w14:noFill/>
+            <w14:prstDash w14:val="solid"/>
+            <w14:bevel/>
+          </w14:textOutline>
+        </w:rPr>
+        <w:t>parties</w:t>
+      </w:r>
+      <w:proofErr w:type="spellEnd"/>
+      <w:r>
+        <w:rPr>
+          <w14:textOutline w14:w="9525" w14:cap="rnd" w14:cmpd="sng" w14:algn="ctr">
+            <w14:noFill/>
+            <w14:prstDash w14:val="solid"/>
+            <w14:bevel/>
+          </w14:textOutline>
+        </w:rPr>
+        <w:t>[</w:t>
+      </w:r>
+      <w:proofErr w:type="gramEnd"/>
+      <w:r>
+        <w:rPr>
+          <w14:textOutline w14:w="9525" w14:cap="rnd" w14:cmpd="sng" w14:algn="ctr">
+            <w14:noFill/>
+            <w14:prstDash w14:val="solid"/>
+            <w14:bevel/>
+          </w14:textOutline>
+        </w:rPr>
+        <w:t>0]'</w:t>
+      </w:r>
+      <w:proofErr w:type="gramStart"/>
+      <w:r>
+        <w:rPr>
+          <w14:textOutline w14:w="9525" w14:cap="rnd" w14:cmpd="sng" w14:algn="ctr">
+            <w14:noFill/>
+            <w14:prstDash w14:val="solid"/>
+            <w14:bevel/>
+          </w14:textOutline>
+        </w:rPr>
+        <w:t xml:space="preserve">) </w:t>
+      </w:r>
+      <w:r>
+        <w:rPr>
+          <w14:textOutline w14:w="9525" w14:cap="rnd" w14:cmpd="sng" w14:algn="ctr">
+            <w14:noFill/>
+            <w14:prstDash w14:val="solid"/>
+            <w14:bevel/>
+          </w14:textOutline>
+        </w:rPr>
+        <w:t>}</w:t>
+      </w:r>
+      <w:proofErr w:type="gramEnd"/>
+      <w:r>
+        <w:rPr>
+          <w14:textOutline w14:w="9525" w14:cap="rnd" w14:cmpd="sng" w14:algn="ctr">
+            <w14:noFill/>
+            <w14:prstDash w14:val="solid"/>
+            <w14:bevel/>
+          </w14:textOutline>
+        </w:rPr>
+        <w:t>}</w:t>
       </w:r>
       <w:r>
         <w:rPr>
@@ -388,15 +769,32 @@
         </w:rPr>
         <w:t xml:space="preserve">If the judge decides to grant your </w:t>
       </w:r>
-      <w:r>
-        <w:t>{{ showifdef("</w:t>
-      </w:r>
+      <w:proofErr w:type="gramStart"/>
+      <w:r>
+        <w:t xml:space="preserve">{{ </w:t>
+      </w:r>
+      <w:proofErr w:type="spellStart"/>
+      <w:r>
+        <w:t>showifdef</w:t>
+      </w:r>
+      <w:proofErr w:type="spellEnd"/>
+      <w:proofErr w:type="gramEnd"/>
+      <w:r>
+        <w:t>("</w:t>
+      </w:r>
+      <w:proofErr w:type="spellStart"/>
       <w:r>
         <w:t>al_next_steps_document_purpose</w:t>
       </w:r>
-      <w:r>
-        <w:t>", "application/petition/complaint") }}:.</w:t>
-      </w:r>
+      <w:proofErr w:type="spellEnd"/>
+      <w:r>
+        <w:t>", "application/petition/complaint"</w:t>
+      </w:r>
+      <w:proofErr w:type="gramStart"/>
+      <w:r>
+        <w:t>) }}:.</w:t>
+      </w:r>
+      <w:proofErr w:type="gramEnd"/>
     </w:p>
     <w:p>
       <w:pPr>
@@ -460,25 +858,47 @@
         <w:t xml:space="preserve">Call the </w:t>
       </w:r>
       <w:r>
-        <w:t xml:space="preserve">{_{ </w:t>
-      </w:r>
-      <w:r>
-        <w:t xml:space="preserve">trial_court </w:t>
-      </w:r>
-      <w:r>
-        <w:t>}_}</w:t>
-      </w:r>
-      <w:r>
-        <w:t xml:space="preserve"> </w:t>
-      </w:r>
-      <w:r>
-        <w:t xml:space="preserve">{_{ </w:t>
-      </w:r>
-      <w:r>
-        <w:t xml:space="preserve">showifdef('trial_court.phone_number') </w:t>
-      </w:r>
-      <w:r>
-        <w:t>}_}</w:t>
+        <w:t xml:space="preserve">court </w:t>
+      </w:r>
+      <w:proofErr w:type="gramStart"/>
+      <w:r>
+        <w:t xml:space="preserve">{{ </w:t>
+      </w:r>
+      <w:proofErr w:type="spellStart"/>
+      <w:r>
+        <w:t>showifdef</w:t>
+      </w:r>
+      <w:proofErr w:type="spellEnd"/>
+      <w:proofErr w:type="gramEnd"/>
+      <w:r>
+        <w:t>('</w:t>
+      </w:r>
+      <w:proofErr w:type="spellStart"/>
+      <w:r>
+        <w:t>trial_</w:t>
+      </w:r>
+      <w:proofErr w:type="gramStart"/>
+      <w:r>
+        <w:t>court.phone</w:t>
+      </w:r>
+      <w:proofErr w:type="gramEnd"/>
+      <w:r>
+        <w:t>_number</w:t>
+      </w:r>
+      <w:proofErr w:type="spellEnd"/>
+      <w:r>
+        <w:t>'</w:t>
+      </w:r>
+      <w:proofErr w:type="gramStart"/>
+      <w:r>
+        <w:t xml:space="preserve">) </w:t>
+      </w:r>
+      <w:r>
+        <w:t>}</w:t>
+      </w:r>
+      <w:proofErr w:type="gramEnd"/>
+      <w:r>
+        <w:t>}</w:t>
       </w:r>
       <w:r>
         <w:t xml:space="preserve"> to find out how they want you to send your forms to them.</w:t>
@@ -493,13 +913,29 @@
         </w:numPr>
       </w:pPr>
       <w:r>
-        <w:t>{_%</w:t>
-      </w:r>
-      <w:r>
-        <w:t xml:space="preserve">p if defined('trial_court.address.address') </w:t>
-      </w:r>
-      <w:r>
-        <w:t>%_}</w:t>
+        <w:t>{%</w:t>
+      </w:r>
+      <w:r>
+        <w:t>p if defined('</w:t>
+      </w:r>
+      <w:proofErr w:type="spellStart"/>
+      <w:r>
+        <w:t>trial_</w:t>
+      </w:r>
+      <w:proofErr w:type="gramStart"/>
+      <w:r>
+        <w:t>court.address</w:t>
+      </w:r>
+      <w:proofErr w:type="gramEnd"/>
+      <w:r>
+        <w:t>.address</w:t>
+      </w:r>
+      <w:proofErr w:type="spellEnd"/>
+      <w:r>
+        <w:t xml:space="preserve">') </w:t>
+      </w:r>
+      <w:r>
+        <w:t>%}</w:t>
       </w:r>
       <w:r>
         <w:t xml:space="preserve"> The address of your court, if you need it, is: </w:t>
@@ -509,14 +945,40 @@
       <w:r>
         <w:br/>
       </w:r>
-      <w:r>
-        <w:t xml:space="preserve">{_{ </w:t>
-      </w:r>
-      <w:r>
-        <w:t xml:space="preserve">trial_court.address.on_one_line() </w:t>
-      </w:r>
-      <w:r>
-        <w:t>}_}</w:t>
+      <w:proofErr w:type="gramStart"/>
+      <w:r>
+        <w:t xml:space="preserve">{{ </w:t>
+      </w:r>
+      <w:proofErr w:type="spellStart"/>
+      <w:r>
+        <w:t>trial</w:t>
+      </w:r>
+      <w:proofErr w:type="gramEnd"/>
+      <w:r>
+        <w:t>_</w:t>
+      </w:r>
+      <w:proofErr w:type="gramStart"/>
+      <w:r>
+        <w:t>court.address</w:t>
+      </w:r>
+      <w:proofErr w:type="gramEnd"/>
+      <w:r>
+        <w:t>.on_one_</w:t>
+      </w:r>
+      <w:proofErr w:type="gramStart"/>
+      <w:r>
+        <w:t>line</w:t>
+      </w:r>
+      <w:proofErr w:type="spellEnd"/>
+      <w:r>
+        <w:t xml:space="preserve">() </w:t>
+      </w:r>
+      <w:r>
+        <w:t>}</w:t>
+      </w:r>
+      <w:proofErr w:type="gramEnd"/>
+      <w:r>
+        <w:t>}</w:t>
       </w:r>
       <w:r>
         <w:t>.</w:t>
@@ -531,13 +993,13 @@
         </w:numPr>
       </w:pPr>
       <w:r>
-        <w:t xml:space="preserve">{_%p </w:t>
+        <w:t xml:space="preserve">{%p </w:t>
       </w:r>
       <w:r>
         <w:t xml:space="preserve">endif </w:t>
       </w:r>
       <w:r>
-        <w:t>%_}</w:t>
+        <w:t>%}</w:t>
       </w:r>
     </w:p>
     <w:p>
@@ -559,28 +1021,64 @@
           <w:rFonts w:ascii="Arial" w:hAnsi="Arial" w:cs="Arial"/>
         </w:rPr>
       </w:pPr>
+      <w:proofErr w:type="gramStart"/>
       <w:r>
         <w:rPr>
           <w:rFonts w:ascii="Arial" w:hAnsi="Arial" w:cs="Arial"/>
         </w:rPr>
-        <w:t>{_{</w:t>
+        <w:t>{{</w:t>
       </w:r>
       <w:r>
         <w:rPr>
           <w:rFonts w:ascii="Arial" w:hAnsi="Arial" w:cs="Arial"/>
         </w:rPr>
-        <w:t xml:space="preserve"> other_parties </w:t>
-      </w:r>
+        <w:t xml:space="preserve"> </w:t>
+      </w:r>
+      <w:proofErr w:type="spellStart"/>
       <w:r>
         <w:rPr>
           <w:rFonts w:ascii="Arial" w:hAnsi="Arial" w:cs="Arial"/>
         </w:rPr>
-        <w:t>}_}</w:t>
-      </w:r>
+        <w:t>other</w:t>
+      </w:r>
+      <w:proofErr w:type="gramEnd"/>
       <w:r>
         <w:rPr>
           <w:rFonts w:ascii="Arial" w:hAnsi="Arial" w:cs="Arial"/>
         </w:rPr>
+        <w:t>_</w:t>
+      </w:r>
+      <w:proofErr w:type="gramStart"/>
+      <w:r>
+        <w:rPr>
+          <w:rFonts w:ascii="Arial" w:hAnsi="Arial" w:cs="Arial"/>
+        </w:rPr>
+        <w:t>parties</w:t>
+      </w:r>
+      <w:proofErr w:type="spellEnd"/>
+      <w:r>
+        <w:rPr>
+          <w:rFonts w:ascii="Arial" w:hAnsi="Arial" w:cs="Arial"/>
+        </w:rPr>
+        <w:t xml:space="preserve"> </w:t>
+      </w:r>
+      <w:r>
+        <w:rPr>
+          <w:rFonts w:ascii="Arial" w:hAnsi="Arial" w:cs="Arial"/>
+        </w:rPr>
+        <w:t>}</w:t>
+      </w:r>
+      <w:proofErr w:type="gramEnd"/>
+      <w:r>
+        <w:rPr>
+          <w:rFonts w:ascii="Arial" w:hAnsi="Arial" w:cs="Arial"/>
+        </w:rPr>
+        <w:t>}</w:t>
+      </w:r>
+      <w:r>
+        <w:rPr>
+          <w:rFonts w:ascii="Arial" w:hAnsi="Arial" w:cs="Arial"/>
+        </w:rPr>
         <w:t xml:space="preserve"> must get a copy of this form. Deliver a copy by hand, mail, or electronic filing.</w:t>
       </w:r>
     </w:p>
@@ -607,16 +1105,32 @@
     </w:p>
     <w:p>
       <w:r>
-        <w:t xml:space="preserve">{%p if </w:t>
-      </w:r>
-      <w:r>
-        <w:t>al_next_steps_enabled and al_n</w:t>
+        <w:t>{%p</w:t>
+      </w:r>
+      <w:r>
+        <w:t xml:space="preserve"> if </w:t>
+      </w:r>
+      <w:proofErr w:type="spellStart"/>
+      <w:r>
+        <w:t>al_next_steps_enabled</w:t>
+      </w:r>
+      <w:proofErr w:type="spellEnd"/>
+      <w:r>
+        <w:t xml:space="preserve"> and </w:t>
+      </w:r>
+      <w:proofErr w:type="spellStart"/>
+      <w:r>
+        <w:t>al_n</w:t>
       </w:r>
       <w:r>
         <w:t>ext_s</w:t>
       </w:r>
       <w:r>
-        <w:t>teps_what_happens_next %}</w:t>
+        <w:t>teps_what_happens_next</w:t>
+      </w:r>
+      <w:proofErr w:type="spellEnd"/>
+      <w:r>
+        <w:t xml:space="preserve"> %}</w:t>
       </w:r>
     </w:p>
     <w:p>
@@ -631,8 +1145,18 @@
       <w:r>
         <w:t xml:space="preserve">{%p for line in </w:t>
       </w:r>
-      <w:r>
-        <w:t>al_next_steps_what_happens_next.split("\n") %}</w:t>
+      <w:proofErr w:type="spellStart"/>
+      <w:r>
+        <w:t>al_next_steps_what_happens_</w:t>
+      </w:r>
+      <w:proofErr w:type="gramStart"/>
+      <w:r>
+        <w:t>next.split</w:t>
+      </w:r>
+      <w:proofErr w:type="spellEnd"/>
+      <w:proofErr w:type="gramEnd"/>
+      <w:r>
+        <w:t>("\n") %}</w:t>
       </w:r>
     </w:p>
     <w:p>
@@ -644,8 +1168,29 @@
         </w:numPr>
         <w:ind w:left="360"/>
       </w:pPr>
-      <w:r>
-        <w:t>{{ fix_punctuation(line) }}</w:t>
+      <w:proofErr w:type="gramStart"/>
+      <w:r>
+        <w:t xml:space="preserve">{{ </w:t>
+      </w:r>
+      <w:proofErr w:type="spellStart"/>
+      <w:r>
+        <w:t>fix</w:t>
+      </w:r>
+      <w:proofErr w:type="gramEnd"/>
+      <w:r>
+        <w:t>_punctuation</w:t>
+      </w:r>
+      <w:proofErr w:type="spellEnd"/>
+      <w:r>
+        <w:t>(line</w:t>
+      </w:r>
+      <w:proofErr w:type="gramStart"/>
+      <w:r>
+        <w:t>) }</w:t>
+      </w:r>
+      <w:proofErr w:type="gramEnd"/>
+      <w:r>
+        <w:t>}</w:t>
       </w:r>
     </w:p>
     <w:p>
@@ -658,7 +1203,15 @@
         <w:ind w:left="360"/>
       </w:pPr>
       <w:r>
-        <w:t>{%p endfor %}</w:t>
+        <w:t xml:space="preserve">{%p </w:t>
+      </w:r>
+      <w:proofErr w:type="spellStart"/>
+      <w:r>
+        <w:t>endfor</w:t>
+      </w:r>
+      <w:proofErr w:type="spellEnd"/>
+      <w:r>
+        <w:t xml:space="preserve"> %}</w:t>
       </w:r>
     </w:p>
     <w:p>
@@ -674,13 +1227,34 @@
         <w:t>Tell</w:t>
       </w:r>
       <w:r>
-        <w:t xml:space="preserve"> the judge why you need a {{ </w:t>
-      </w:r>
-      <w:r>
-        <w:t>al_next_steps_t</w:t>
-      </w:r>
-      <w:r>
-        <w:t>itle }}. Talk about the facts that you wrote in your complaint. Tell the judge about any evidence that you have.</w:t>
+        <w:t xml:space="preserve"> the judge why you need a </w:t>
+      </w:r>
+      <w:proofErr w:type="gramStart"/>
+      <w:r>
+        <w:t xml:space="preserve">{{ </w:t>
+      </w:r>
+      <w:proofErr w:type="spellStart"/>
+      <w:r>
+        <w:t>al</w:t>
+      </w:r>
+      <w:proofErr w:type="gramEnd"/>
+      <w:r>
+        <w:t>_next_steps_</w:t>
+      </w:r>
+      <w:proofErr w:type="gramStart"/>
+      <w:r>
+        <w:t>t</w:t>
+      </w:r>
+      <w:r>
+        <w:t>itle</w:t>
+      </w:r>
+      <w:proofErr w:type="spellEnd"/>
+      <w:r>
+        <w:t xml:space="preserve"> }</w:t>
+      </w:r>
+      <w:proofErr w:type="gramEnd"/>
+      <w:r>
+        <w:t>}. Talk about the facts that you wrote in your complaint. Tell the judge about any evidence that you have.</w:t>
       </w:r>
     </w:p>
     <w:p>
@@ -700,14 +1274,27 @@
       <w:r>
         <w:t xml:space="preserve">{%p if </w:t>
       </w:r>
-      <w:r>
-        <w:t>al_next_steps_enabled and al_n</w:t>
+      <w:proofErr w:type="spellStart"/>
+      <w:r>
+        <w:t>al_next_steps_enabled</w:t>
+      </w:r>
+      <w:proofErr w:type="spellEnd"/>
+      <w:r>
+        <w:t xml:space="preserve"> and </w:t>
+      </w:r>
+      <w:proofErr w:type="spellStart"/>
+      <w:r>
+        <w:t>al_n</w:t>
       </w:r>
       <w:r>
         <w:t>ext_s</w:t>
       </w:r>
       <w:r>
-        <w:t>teps_what_can_decision_maker_do %}</w:t>
+        <w:t>teps_what_can_decision_maker_do</w:t>
+      </w:r>
+      <w:proofErr w:type="spellEnd"/>
+      <w:r>
+        <w:t xml:space="preserve"> %}</w:t>
       </w:r>
     </w:p>
     <w:p>
@@ -722,8 +1309,18 @@
       <w:r>
         <w:t xml:space="preserve">{%p for line in </w:t>
       </w:r>
-      <w:r>
-        <w:t>al_next_steps_what_can_decision_maker_do.split("\n") %}</w:t>
+      <w:proofErr w:type="spellStart"/>
+      <w:r>
+        <w:t>al_next_steps_what_can_decision_maker_</w:t>
+      </w:r>
+      <w:proofErr w:type="gramStart"/>
+      <w:r>
+        <w:t>do.split</w:t>
+      </w:r>
+      <w:proofErr w:type="spellEnd"/>
+      <w:proofErr w:type="gramEnd"/>
+      <w:r>
+        <w:t>("\n") %}</w:t>
       </w:r>
     </w:p>
     <w:p>
@@ -735,8 +1332,29 @@
         </w:numPr>
         <w:ind w:left="360"/>
       </w:pPr>
-      <w:r>
-        <w:t>{{ fix_punctuation(line) }}</w:t>
+      <w:proofErr w:type="gramStart"/>
+      <w:r>
+        <w:t xml:space="preserve">{{ </w:t>
+      </w:r>
+      <w:proofErr w:type="spellStart"/>
+      <w:r>
+        <w:t>fix</w:t>
+      </w:r>
+      <w:proofErr w:type="gramEnd"/>
+      <w:r>
+        <w:t>_punctuation</w:t>
+      </w:r>
+      <w:proofErr w:type="spellEnd"/>
+      <w:r>
+        <w:t>(line</w:t>
+      </w:r>
+      <w:proofErr w:type="gramStart"/>
+      <w:r>
+        <w:t>) }</w:t>
+      </w:r>
+      <w:proofErr w:type="gramEnd"/>
+      <w:r>
+        <w:t>}</w:t>
       </w:r>
     </w:p>
     <w:p>
@@ -749,7 +1367,15 @@
         <w:ind w:left="360"/>
       </w:pPr>
       <w:r>
-        <w:t>{%p endfor %}</w:t>
+        <w:t xml:space="preserve">{%p </w:t>
+      </w:r>
+      <w:proofErr w:type="spellStart"/>
+      <w:r>
+        <w:t>endfor</w:t>
+      </w:r>
+      <w:proofErr w:type="spellEnd"/>
+      <w:r>
+        <w:t xml:space="preserve"> %}</w:t>
       </w:r>
     </w:p>
     <w:p>
@@ -774,14 +1400,27 @@
       <w:r>
         <w:t xml:space="preserve">{%p if </w:t>
       </w:r>
-      <w:r>
-        <w:t>al_next_steps_enabled and al_n</w:t>
+      <w:proofErr w:type="spellStart"/>
+      <w:r>
+        <w:t>al_next_steps_enabled</w:t>
+      </w:r>
+      <w:proofErr w:type="spellEnd"/>
+      <w:r>
+        <w:t xml:space="preserve"> and </w:t>
+      </w:r>
+      <w:proofErr w:type="spellStart"/>
+      <w:r>
+        <w:t>al_n</w:t>
       </w:r>
       <w:r>
         <w:t>ext_s</w:t>
       </w:r>
       <w:r>
-        <w:t>teps_what_can_decision_maker_do %}</w:t>
+        <w:t>teps_what_can_decision_maker_do</w:t>
+      </w:r>
+      <w:proofErr w:type="spellEnd"/>
+      <w:r>
+        <w:t xml:space="preserve"> %}</w:t>
       </w:r>
     </w:p>
     <w:p>
@@ -796,8 +1435,18 @@
       <w:r>
         <w:t xml:space="preserve">{%p for line in </w:t>
       </w:r>
-      <w:r>
-        <w:t>al_next_steps_what_happens_if_i_win.split("\n") %}</w:t>
+      <w:proofErr w:type="spellStart"/>
+      <w:r>
+        <w:t>al_next_steps_what_happens_if_i_</w:t>
+      </w:r>
+      <w:proofErr w:type="gramStart"/>
+      <w:r>
+        <w:t>win.split</w:t>
+      </w:r>
+      <w:proofErr w:type="spellEnd"/>
+      <w:proofErr w:type="gramEnd"/>
+      <w:r>
+        <w:t>("\n") %}</w:t>
       </w:r>
     </w:p>
     <w:p>
@@ -809,8 +1458,29 @@
         </w:numPr>
         <w:ind w:left="360"/>
       </w:pPr>
-      <w:r>
-        <w:t>{{ fix_punctuation(line) }}</w:t>
+      <w:proofErr w:type="gramStart"/>
+      <w:r>
+        <w:t xml:space="preserve">{{ </w:t>
+      </w:r>
+      <w:proofErr w:type="spellStart"/>
+      <w:r>
+        <w:t>fix</w:t>
+      </w:r>
+      <w:proofErr w:type="gramEnd"/>
+      <w:r>
+        <w:t>_punctuation</w:t>
+      </w:r>
+      <w:proofErr w:type="spellEnd"/>
+      <w:r>
+        <w:t>(line</w:t>
+      </w:r>
+      <w:proofErr w:type="gramStart"/>
+      <w:r>
+        <w:t>) }</w:t>
+      </w:r>
+      <w:proofErr w:type="gramEnd"/>
+      <w:r>
+        <w:t>}</w:t>
       </w:r>
     </w:p>
     <w:p>
@@ -823,7 +1493,15 @@
         <w:ind w:left="360"/>
       </w:pPr>
       <w:r>
-        <w:t>{%p endfor %}</w:t>
+        <w:t xml:space="preserve">{%p </w:t>
+      </w:r>
+      <w:proofErr w:type="spellStart"/>
+      <w:r>
+        <w:t>endfor</w:t>
+      </w:r>
+      <w:proofErr w:type="spellEnd"/>
+      <w:r>
+        <w:t xml:space="preserve"> %}</w:t>
       </w:r>
     </w:p>
     <w:p>
@@ -868,8 +1546,13 @@
       <w:r>
         <w:t xml:space="preserve">{%p if </w:t>
       </w:r>
-      <w:r>
-        <w:t>al_next_steps_enabled %}</w:t>
+      <w:proofErr w:type="spellStart"/>
+      <w:r>
+        <w:t>al_next_steps_enabled</w:t>
+      </w:r>
+      <w:proofErr w:type="spellEnd"/>
+      <w:r>
+        <w:t xml:space="preserve"> %}</w:t>
       </w:r>
     </w:p>
     <w:p>
@@ -882,11 +1565,47 @@
       <w:r>
         <w:t xml:space="preserve">Visit </w:t>
       </w:r>
+      <w:proofErr w:type="gramStart"/>
       <w:r>
         <w:rPr>
           <w:b/>
         </w:rPr>
-        <w:t>{{ al_next_steps_help_url }}</w:t>
+        <w:t xml:space="preserve">{{ </w:t>
+      </w:r>
+      <w:proofErr w:type="spellStart"/>
+      <w:r>
+        <w:rPr>
+          <w:b/>
+        </w:rPr>
+        <w:t>al</w:t>
+      </w:r>
+      <w:proofErr w:type="gramEnd"/>
+      <w:r>
+        <w:rPr>
+          <w:b/>
+        </w:rPr>
+        <w:t>_next_steps_help_</w:t>
+      </w:r>
+      <w:proofErr w:type="gramStart"/>
+      <w:r>
+        <w:rPr>
+          <w:b/>
+        </w:rPr>
+        <w:t>url</w:t>
+      </w:r>
+      <w:proofErr w:type="spellEnd"/>
+      <w:r>
+        <w:rPr>
+          <w:b/>
+        </w:rPr>
+        <w:t xml:space="preserve"> }</w:t>
+      </w:r>
+      <w:proofErr w:type="gramEnd"/>
+      <w:r>
+        <w:rPr>
+          <w:b/>
+        </w:rPr>
+        <w:t>}</w:t>
       </w:r>
     </w:p>
     <w:p>
@@ -909,7 +1628,15 @@
         <w:t>p</w:t>
       </w:r>
       <w:r>
-        <w:t xml:space="preserve"> if al_next_steps_generate_qr_code %}</w:t>
+        <w:t xml:space="preserve"> if </w:t>
+      </w:r>
+      <w:proofErr w:type="spellStart"/>
+      <w:r>
+        <w:t>al_next_steps_generate_qr_code</w:t>
+      </w:r>
+      <w:proofErr w:type="spellEnd"/>
+      <w:r>
+        <w:t xml:space="preserve"> %}</w:t>
       </w:r>
     </w:p>
     <w:p>
@@ -932,13 +1659,50 @@
         <w:t>{p</w:t>
       </w:r>
       <w:r>
-        <w:t xml:space="preserve"> qr_code(al_next_steps_help_url, width</w:t>
-      </w:r>
-      <w:r>
-        <w:t>="1in", alt_text="al_next</w:t>
-      </w:r>
-      <w:r>
-        <w:t>_steps_help_url") | markdown</w:t>
+        <w:t xml:space="preserve"> </w:t>
+      </w:r>
+      <w:proofErr w:type="spellStart"/>
+      <w:r>
+        <w:t>qr_</w:t>
+      </w:r>
+      <w:proofErr w:type="gramStart"/>
+      <w:r>
+        <w:t>code</w:t>
+      </w:r>
+      <w:proofErr w:type="spellEnd"/>
+      <w:r>
+        <w:t>(</w:t>
+      </w:r>
+      <w:proofErr w:type="spellStart"/>
+      <w:proofErr w:type="gramEnd"/>
+      <w:r>
+        <w:t>al_next_steps_help_url</w:t>
+      </w:r>
+      <w:proofErr w:type="spellEnd"/>
+      <w:r>
+        <w:t>, width</w:t>
+      </w:r>
+      <w:r>
+        <w:t xml:space="preserve">="1in", </w:t>
+      </w:r>
+      <w:proofErr w:type="spellStart"/>
+      <w:r>
+        <w:t>alt_text</w:t>
+      </w:r>
+      <w:proofErr w:type="spellEnd"/>
+      <w:r>
+        <w:t>="</w:t>
+      </w:r>
+      <w:proofErr w:type="spellStart"/>
+      <w:r>
+        <w:t>al_next</w:t>
+      </w:r>
+      <w:r>
+        <w:t>_steps_help_url</w:t>
+      </w:r>
+      <w:proofErr w:type="spellEnd"/>
+      <w:r>
+        <w:t>") | markdown</w:t>
       </w:r>
       <w:r>
         <w:t>}</w:t>
@@ -968,7 +1732,7 @@
 </file>
 
 <file path=word/endnotes.xml><?xml version="1.0" encoding="utf-8"?>
-<w:endnotes xmlns:wpc="http://schemas.microsoft.com/office/word/2010/wordprocessingCanvas" xmlns:cx="http://schemas.microsoft.com/office/drawing/2014/chartex" xmlns:cx1="http://schemas.microsoft.com/office/drawing/2015/9/8/chartex" xmlns:cx2="http://schemas.microsoft.com/office/drawing/2015/10/21/chartex" xmlns:cx3="http://schemas.microsoft.com/office/drawing/2016/5/9/chartex" xmlns:cx4="http://schemas.microsoft.com/office/drawing/2016/5/10/chartex" xmlns:cx5="http://schemas.microsoft.com/office/drawing/2016/5/11/chartex" xmlns:cx6="http://schemas.microsoft.com/office/drawing/2016/5/12/chartex" xmlns:cx7="http://schemas.microsoft.com/office/drawing/2016/5/13/chartex" xmlns:cx8="http://schemas.microsoft.com/office/drawing/2016/5/14/chartex" xmlns:mc="http://schemas.openxmlformats.org/markup-compatibility/2006" xmlns:aink="http://schemas.microsoft.com/office/drawing/2016/ink" xmlns:am3d="http://schemas.microsoft.com/office/drawing/2017/model3d" xmlns:o="urn:schemas-microsoft-com:office:office" xmlns:r="http://schemas.openxmlformats.org/officeDocument/2006/relationships" xmlns:m="http://schemas.openxmlformats.org/officeDocument/2006/math" xmlns:v="urn:schemas-microsoft-com:vml" xmlns:wp14="http://schemas.microsoft.com/office/word/2010/wordprocessingDrawing" xmlns:wp="http://schemas.openxmlformats.org/drawingml/2006/wordprocessingDrawing" xmlns:w10="urn:schemas-microsoft-com:office:word" xmlns:w="http://schemas.openxmlformats.org/wordprocessingml/2006/main" xmlns:w14="http://schemas.microsoft.com/office/word/2010/wordml" xmlns:w15="http://schemas.microsoft.com/office/word/2012/wordml" xmlns:w16cex="http://schemas.microsoft.com/office/word/2018/wordml/cex" xmlns:w16cid="http://schemas.microsoft.com/office/word/2016/wordml/cid" xmlns:w16="http://schemas.microsoft.com/office/word/2018/wordml" xmlns:w16sdtdh="http://schemas.microsoft.com/office/word/2020/wordml/sdtdatahash" xmlns:w16se="http://schemas.microsoft.com/office/word/2015/wordml/symex" xmlns:wpg="http://schemas.microsoft.com/office/word/2010/wordprocessingGroup" xmlns:wpi="http://schemas.microsoft.com/office/word/2010/wordprocessingInk" xmlns:wne="http://schemas.microsoft.com/office/word/2006/wordml" xmlns:wps="http://schemas.microsoft.com/office/word/2010/wordprocessingShape" mc:Ignorable="w14 w15 w16se w16cid w16 w16cex w16sdtdh wp14">
+<w:endnotes xmlns:wpc="http://schemas.microsoft.com/office/word/2010/wordprocessingCanvas" xmlns:cx="http://schemas.microsoft.com/office/drawing/2014/chartex" xmlns:cx1="http://schemas.microsoft.com/office/drawing/2015/9/8/chartex" xmlns:cx2="http://schemas.microsoft.com/office/drawing/2015/10/21/chartex" xmlns:cx3="http://schemas.microsoft.com/office/drawing/2016/5/9/chartex" xmlns:cx4="http://schemas.microsoft.com/office/drawing/2016/5/10/chartex" xmlns:cx5="http://schemas.microsoft.com/office/drawing/2016/5/11/chartex" xmlns:cx6="http://schemas.microsoft.com/office/drawing/2016/5/12/chartex" xmlns:cx7="http://schemas.microsoft.com/office/drawing/2016/5/13/chartex" xmlns:cx8="http://schemas.microsoft.com/office/drawing/2016/5/14/chartex" xmlns:mc="http://schemas.openxmlformats.org/markup-compatibility/2006" xmlns:m="http://schemas.openxmlformats.org/officeDocument/2006/math" xmlns:aink="http://schemas.microsoft.com/office/drawing/2016/ink" xmlns:am3d="http://schemas.microsoft.com/office/drawing/2017/model3d" xmlns:oel="http://schemas.microsoft.com/office/2019/extlst" xmlns:r="http://schemas.openxmlformats.org/officeDocument/2006/relationships" xmlns:wp14="http://schemas.microsoft.com/office/word/2010/wordprocessingDrawing" xmlns:wp="http://schemas.openxmlformats.org/drawingml/2006/wordprocessingDrawing" xmlns:wpg="http://schemas.microsoft.com/office/word/2010/wordprocessingGroup" xmlns:wpi="http://schemas.microsoft.com/office/word/2010/wordprocessingInk" xmlns:wps="http://schemas.microsoft.com/office/word/2010/wordprocessingShape" xmlns:o="urn:schemas-microsoft-com:office:office" xmlns:v="urn:schemas-microsoft-com:vml" xmlns:w10="urn:schemas-microsoft-com:office:word" xmlns:w="http://schemas.openxmlformats.org/wordprocessingml/2006/main" xmlns:w14="http://schemas.microsoft.com/office/word/2010/wordml" xmlns:w15="http://schemas.microsoft.com/office/word/2012/wordml" xmlns:w16cex="http://schemas.microsoft.com/office/word/2018/wordml/cex" xmlns:w16cid="http://schemas.microsoft.com/office/word/2016/wordml/cid" xmlns:w16="http://schemas.microsoft.com/office/word/2018/wordml" xmlns:w16sdtdh="http://schemas.microsoft.com/office/word/2020/wordml/sdtdatahash" xmlns:w16sdtfl="http://schemas.microsoft.com/office/word/2024/wordml/sdtformatlock" xmlns:w16se="http://schemas.microsoft.com/office/word/2015/wordml/symex" xmlns:w16du="http://schemas.microsoft.com/office/word/2023/wordml/word16du" xmlns:wne="http://schemas.microsoft.com/office/word/2006/wordml" mc:Ignorable="w14 w15 w16se w16cid w16 w16cex w16sdtdh w16sdtfl w16du wp14">
   <w:endnote w:type="separator" w:id="-1">
     <w:p>
       <w:pPr>
@@ -993,7 +1757,7 @@
 </file>
 
 <file path=word/footer1.xml><?xml version="1.0" encoding="utf-8"?>
-<w:ftr xmlns:wpc="http://schemas.microsoft.com/office/word/2010/wordprocessingCanvas" xmlns:cx="http://schemas.microsoft.com/office/drawing/2014/chartex" xmlns:cx1="http://schemas.microsoft.com/office/drawing/2015/9/8/chartex" xmlns:cx2="http://schemas.microsoft.com/office/drawing/2015/10/21/chartex" xmlns:cx3="http://schemas.microsoft.com/office/drawing/2016/5/9/chartex" xmlns:cx4="http://schemas.microsoft.com/office/drawing/2016/5/10/chartex" xmlns:cx5="http://schemas.microsoft.com/office/drawing/2016/5/11/chartex" xmlns:cx6="http://schemas.microsoft.com/office/drawing/2016/5/12/chartex" xmlns:cx7="http://schemas.microsoft.com/office/drawing/2016/5/13/chartex" xmlns:cx8="http://schemas.microsoft.com/office/drawing/2016/5/14/chartex" xmlns:mc="http://schemas.openxmlformats.org/markup-compatibility/2006" xmlns:aink="http://schemas.microsoft.com/office/drawing/2016/ink" xmlns:am3d="http://schemas.microsoft.com/office/drawing/2017/model3d" xmlns:o="urn:schemas-microsoft-com:office:office" xmlns:r="http://schemas.openxmlformats.org/officeDocument/2006/relationships" xmlns:m="http://schemas.openxmlformats.org/officeDocument/2006/math" xmlns:v="urn:schemas-microsoft-com:vml" xmlns:wp14="http://schemas.microsoft.com/office/word/2010/wordprocessingDrawing" xmlns:wp="http://schemas.openxmlformats.org/drawingml/2006/wordprocessingDrawing" xmlns:w10="urn:schemas-microsoft-com:office:word" xmlns:w="http://schemas.openxmlformats.org/wordprocessingml/2006/main" xmlns:w14="http://schemas.microsoft.com/office/word/2010/wordml" xmlns:w15="http://schemas.microsoft.com/office/word/2012/wordml" xmlns:w16cex="http://schemas.microsoft.com/office/word/2018/wordml/cex" xmlns:w16cid="http://schemas.microsoft.com/office/word/2016/wordml/cid" xmlns:w16="http://schemas.microsoft.com/office/word/2018/wordml" xmlns:w16sdtdh="http://schemas.microsoft.com/office/word/2020/wordml/sdtdatahash" xmlns:w16se="http://schemas.microsoft.com/office/word/2015/wordml/symex" xmlns:wpg="http://schemas.microsoft.com/office/word/2010/wordprocessingGroup" xmlns:wpi="http://schemas.microsoft.com/office/word/2010/wordprocessingInk" xmlns:wne="http://schemas.microsoft.com/office/word/2006/wordml" xmlns:wps="http://schemas.microsoft.com/office/word/2010/wordprocessingShape" mc:Ignorable="w14 w15 w16se w16cid w16 w16cex w16sdtdh wp14">
+<w:ftr xmlns:wpc="http://schemas.microsoft.com/office/word/2010/wordprocessingCanvas" xmlns:cx="http://schemas.microsoft.com/office/drawing/2014/chartex" xmlns:cx1="http://schemas.microsoft.com/office/drawing/2015/9/8/chartex" xmlns:cx2="http://schemas.microsoft.com/office/drawing/2015/10/21/chartex" xmlns:cx3="http://schemas.microsoft.com/office/drawing/2016/5/9/chartex" xmlns:cx4="http://schemas.microsoft.com/office/drawing/2016/5/10/chartex" xmlns:cx5="http://schemas.microsoft.com/office/drawing/2016/5/11/chartex" xmlns:cx6="http://schemas.microsoft.com/office/drawing/2016/5/12/chartex" xmlns:cx7="http://schemas.microsoft.com/office/drawing/2016/5/13/chartex" xmlns:cx8="http://schemas.microsoft.com/office/drawing/2016/5/14/chartex" xmlns:mc="http://schemas.openxmlformats.org/markup-compatibility/2006" xmlns:m="http://schemas.openxmlformats.org/officeDocument/2006/math" xmlns:aink="http://schemas.microsoft.com/office/drawing/2016/ink" xmlns:am3d="http://schemas.microsoft.com/office/drawing/2017/model3d" xmlns:oel="http://schemas.microsoft.com/office/2019/extlst" xmlns:r="http://schemas.openxmlformats.org/officeDocument/2006/relationships" xmlns:wp14="http://schemas.microsoft.com/office/word/2010/wordprocessingDrawing" xmlns:wp="http://schemas.openxmlformats.org/drawingml/2006/wordprocessingDrawing" xmlns:wpg="http://schemas.microsoft.com/office/word/2010/wordprocessingGroup" xmlns:wpi="http://schemas.microsoft.com/office/word/2010/wordprocessingInk" xmlns:wps="http://schemas.microsoft.com/office/word/2010/wordprocessingShape" xmlns:o="urn:schemas-microsoft-com:office:office" xmlns:v="urn:schemas-microsoft-com:vml" xmlns:w10="urn:schemas-microsoft-com:office:word" xmlns:w="http://schemas.openxmlformats.org/wordprocessingml/2006/main" xmlns:w14="http://schemas.microsoft.com/office/word/2010/wordml" xmlns:w15="http://schemas.microsoft.com/office/word/2012/wordml" xmlns:w16cex="http://schemas.microsoft.com/office/word/2018/wordml/cex" xmlns:w16cid="http://schemas.microsoft.com/office/word/2016/wordml/cid" xmlns:w16="http://schemas.microsoft.com/office/word/2018/wordml" xmlns:w16sdtdh="http://schemas.microsoft.com/office/word/2020/wordml/sdtdatahash" xmlns:w16sdtfl="http://schemas.microsoft.com/office/word/2024/wordml/sdtformatlock" xmlns:w16se="http://schemas.microsoft.com/office/word/2015/wordml/symex" xmlns:w16du="http://schemas.microsoft.com/office/word/2023/wordml/word16du" xmlns:wne="http://schemas.microsoft.com/office/word/2006/wordml" mc:Ignorable="w14 w15 w16se w16cid w16 w16cex w16sdtdh w16sdtfl w16du wp14">
   <w:p>
     <w:pPr>
       <w:pStyle w:val="Footer"/>
@@ -1070,7 +1834,25 @@
                               <w:color w:val="000000" w:themeColor="text1"/>
                               <w:sz w:val="22"/>
                             </w:rPr>
-                            <w:t xml:space="preserve">Find out more about what to do : </w:t>
+                            <w:t xml:space="preserve">Find out more about what to </w:t>
+                          </w:r>
+                          <w:proofErr w:type="gramStart"/>
+                          <w:r>
+                            <w:rPr>
+                              <w:rFonts w:ascii="Arial" w:hAnsi="Arial" w:cs="Arial"/>
+                              <w:color w:val="000000" w:themeColor="text1"/>
+                              <w:sz w:val="22"/>
+                            </w:rPr>
+                            <w:t>do :</w:t>
+                          </w:r>
+                          <w:proofErr w:type="gramEnd"/>
+                          <w:r>
+                            <w:rPr>
+                              <w:rFonts w:ascii="Arial" w:hAnsi="Arial" w:cs="Arial"/>
+                              <w:color w:val="000000" w:themeColor="text1"/>
+                              <w:sz w:val="22"/>
+                            </w:rPr>
+                            <w:t xml:space="preserve"> </w:t>
                           </w:r>
                         </w:p>
                         <w:p/>
@@ -1090,7 +1872,7 @@
         </mc:Choice>
         <mc:Fallback>
           <w:pict>
-            <v:roundrect w14:anchorId="06C0F375" id="Rounded Rectangle 6" o:spid="_x0000_s1026" style="width:539.8pt;height:63.5pt;visibility:visible;mso-wrap-style:square;mso-left-percent:-10001;mso-top-percent:-10001;mso-position-horizontal:absolute;mso-position-horizontal-relative:char;mso-position-vertical:absolute;mso-position-vertical-relative:line;mso-left-percent:-10001;mso-top-percent:-10001;v-text-anchor:middle" arcsize="10923f" o:gfxdata="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" fillcolor="#f2f2f2 [3052]" strokecolor="#bfbfbf [2412]" strokeweight=".18mm">
+            <v:roundrect w14:anchorId="06C0F375" id="Rounded Rectangle 6" o:spid="_x0000_s1026" style="width:539.8pt;height:63.5pt;visibility:visible;mso-wrap-style:square;mso-left-percent:-10001;mso-top-percent:-10001;mso-position-horizontal:absolute;mso-position-horizontal-relative:char;mso-position-vertical:absolute;mso-position-vertical-relative:line;mso-left-percent:-10001;mso-top-percent:-10001;v-text-anchor:middle" arcsize="10923f" o:gfxdata="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" fillcolor="#f2f2f2 [3052]" strokecolor="#bfbfbf [2412]" strokeweight=".18mm">
               <v:stroke joinstyle="miter"/>
               <v:textbox inset="14.4pt,14.4pt,14.4pt,14.4pt">
                 <w:txbxContent>
@@ -1108,7 +1890,25 @@
                         <w:color w:val="000000" w:themeColor="text1"/>
                         <w:sz w:val="22"/>
                       </w:rPr>
-                      <w:t xml:space="preserve">Find out more about what to do : </w:t>
+                      <w:t xml:space="preserve">Find out more about what to </w:t>
+                    </w:r>
+                    <w:proofErr w:type="gramStart"/>
+                    <w:r>
+                      <w:rPr>
+                        <w:rFonts w:ascii="Arial" w:hAnsi="Arial" w:cs="Arial"/>
+                        <w:color w:val="000000" w:themeColor="text1"/>
+                        <w:sz w:val="22"/>
+                      </w:rPr>
+                      <w:t>do :</w:t>
+                    </w:r>
+                    <w:proofErr w:type="gramEnd"/>
+                    <w:r>
+                      <w:rPr>
+                        <w:rFonts w:ascii="Arial" w:hAnsi="Arial" w:cs="Arial"/>
+                        <w:color w:val="000000" w:themeColor="text1"/>
+                        <w:sz w:val="22"/>
+                      </w:rPr>
+                      <w:t xml:space="preserve"> </w:t>
                     </w:r>
                   </w:p>
                   <w:p/>
@@ -1125,7 +1925,7 @@
 </file>
 
 <file path=word/footnotes.xml><?xml version="1.0" encoding="utf-8"?>
-<w:footnotes xmlns:wpc="http://schemas.microsoft.com/office/word/2010/wordprocessingCanvas" xmlns:cx="http://schemas.microsoft.com/office/drawing/2014/chartex" xmlns:cx1="http://schemas.microsoft.com/office/drawing/2015/9/8/chartex" xmlns:cx2="http://schemas.microsoft.com/office/drawing/2015/10/21/chartex" xmlns:cx3="http://schemas.microsoft.com/office/drawing/2016/5/9/chartex" xmlns:cx4="http://schemas.microsoft.com/office/drawing/2016/5/10/chartex" xmlns:cx5="http://schemas.microsoft.com/office/drawing/2016/5/11/chartex" xmlns:cx6="http://schemas.microsoft.com/office/drawing/2016/5/12/chartex" xmlns:cx7="http://schemas.microsoft.com/office/drawing/2016/5/13/chartex" xmlns:cx8="http://schemas.microsoft.com/office/drawing/2016/5/14/chartex" xmlns:mc="http://schemas.openxmlformats.org/markup-compatibility/2006" xmlns:aink="http://schemas.microsoft.com/office/drawing/2016/ink" xmlns:am3d="http://schemas.microsoft.com/office/drawing/2017/model3d" xmlns:o="urn:schemas-microsoft-com:office:office" xmlns:r="http://schemas.openxmlformats.org/officeDocument/2006/relationships" xmlns:m="http://schemas.openxmlformats.org/officeDocument/2006/math" xmlns:v="urn:schemas-microsoft-com:vml" xmlns:wp14="http://schemas.microsoft.com/office/word/2010/wordprocessingDrawing" xmlns:wp="http://schemas.openxmlformats.org/drawingml/2006/wordprocessingDrawing" xmlns:w10="urn:schemas-microsoft-com:office:word" xmlns:w="http://schemas.openxmlformats.org/wordprocessingml/2006/main" xmlns:w14="http://schemas.microsoft.com/office/word/2010/wordml" xmlns:w15="http://schemas.microsoft.com/office/word/2012/wordml" xmlns:w16cex="http://schemas.microsoft.com/office/word/2018/wordml/cex" xmlns:w16cid="http://schemas.microsoft.com/office/word/2016/wordml/cid" xmlns:w16="http://schemas.microsoft.com/office/word/2018/wordml" xmlns:w16sdtdh="http://schemas.microsoft.com/office/word/2020/wordml/sdtdatahash" xmlns:w16se="http://schemas.microsoft.com/office/word/2015/wordml/symex" xmlns:wpg="http://schemas.microsoft.com/office/word/2010/wordprocessingGroup" xmlns:wpi="http://schemas.microsoft.com/office/word/2010/wordprocessingInk" xmlns:wne="http://schemas.microsoft.com/office/word/2006/wordml" xmlns:wps="http://schemas.microsoft.com/office/word/2010/wordprocessingShape" mc:Ignorable="w14 w15 w16se w16cid w16 w16cex w16sdtdh wp14">
+<w:footnotes xmlns:wpc="http://schemas.microsoft.com/office/word/2010/wordprocessingCanvas" xmlns:cx="http://schemas.microsoft.com/office/drawing/2014/chartex" xmlns:cx1="http://schemas.microsoft.com/office/drawing/2015/9/8/chartex" xmlns:cx2="http://schemas.microsoft.com/office/drawing/2015/10/21/chartex" xmlns:cx3="http://schemas.microsoft.com/office/drawing/2016/5/9/chartex" xmlns:cx4="http://schemas.microsoft.com/office/drawing/2016/5/10/chartex" xmlns:cx5="http://schemas.microsoft.com/office/drawing/2016/5/11/chartex" xmlns:cx6="http://schemas.microsoft.com/office/drawing/2016/5/12/chartex" xmlns:cx7="http://schemas.microsoft.com/office/drawing/2016/5/13/chartex" xmlns:cx8="http://schemas.microsoft.com/office/drawing/2016/5/14/chartex" xmlns:mc="http://schemas.openxmlformats.org/markup-compatibility/2006" xmlns:m="http://schemas.openxmlformats.org/officeDocument/2006/math" xmlns:aink="http://schemas.microsoft.com/office/drawing/2016/ink" xmlns:am3d="http://schemas.microsoft.com/office/drawing/2017/model3d" xmlns:oel="http://schemas.microsoft.com/office/2019/extlst" xmlns:r="http://schemas.openxmlformats.org/officeDocument/2006/relationships" xmlns:wp14="http://schemas.microsoft.com/office/word/2010/wordprocessingDrawing" xmlns:wp="http://schemas.openxmlformats.org/drawingml/2006/wordprocessingDrawing" xmlns:wpg="http://schemas.microsoft.com/office/word/2010/wordprocessingGroup" xmlns:wpi="http://schemas.microsoft.com/office/word/2010/wordprocessingInk" xmlns:wps="http://schemas.microsoft.com/office/word/2010/wordprocessingShape" xmlns:o="urn:schemas-microsoft-com:office:office" xmlns:v="urn:schemas-microsoft-com:vml" xmlns:w10="urn:schemas-microsoft-com:office:word" xmlns:w="http://schemas.openxmlformats.org/wordprocessingml/2006/main" xmlns:w14="http://schemas.microsoft.com/office/word/2010/wordml" xmlns:w15="http://schemas.microsoft.com/office/word/2012/wordml" xmlns:w16cex="http://schemas.microsoft.com/office/word/2018/wordml/cex" xmlns:w16cid="http://schemas.microsoft.com/office/word/2016/wordml/cid" xmlns:w16="http://schemas.microsoft.com/office/word/2018/wordml" xmlns:w16sdtdh="http://schemas.microsoft.com/office/word/2020/wordml/sdtdatahash" xmlns:w16sdtfl="http://schemas.microsoft.com/office/word/2024/wordml/sdtformatlock" xmlns:w16se="http://schemas.microsoft.com/office/word/2015/wordml/symex" xmlns:w16du="http://schemas.microsoft.com/office/word/2023/wordml/word16du" xmlns:wne="http://schemas.microsoft.com/office/word/2006/wordml" mc:Ignorable="w14 w15 w16se w16cid w16 w16cex w16sdtdh w16sdtfl w16du wp14">
   <w:footnote w:type="separator" w:id="-1">
     <w:p>
       <w:pPr>
@@ -1150,7 +1950,7 @@
 </file>
 
 <file path=word/numbering.xml><?xml version="1.0" encoding="utf-8"?>
-<w:numbering xmlns:wpc="http://schemas.microsoft.com/office/word/2010/wordprocessingCanvas" xmlns:cx="http://schemas.microsoft.com/office/drawing/2014/chartex" xmlns:cx1="http://schemas.microsoft.com/office/drawing/2015/9/8/chartex" xmlns:cx2="http://schemas.microsoft.com/office/drawing/2015/10/21/chartex" xmlns:cx3="http://schemas.microsoft.com/office/drawing/2016/5/9/chartex" xmlns:cx4="http://schemas.microsoft.com/office/drawing/2016/5/10/chartex" xmlns:cx5="http://schemas.microsoft.com/office/drawing/2016/5/11/chartex" xmlns:cx6="http://schemas.microsoft.com/office/drawing/2016/5/12/chartex" xmlns:cx7="http://schemas.microsoft.com/office/drawing/2016/5/13/chartex" xmlns:cx8="http://schemas.microsoft.com/office/drawing/2016/5/14/chartex" xmlns:mc="http://schemas.openxmlformats.org/markup-compatibility/2006" xmlns:aink="http://schemas.microsoft.com/office/drawing/2016/ink" xmlns:am3d="http://schemas.microsoft.com/office/drawing/2017/model3d" xmlns:o="urn:schemas-microsoft-com:office:office" xmlns:r="http://schemas.openxmlformats.org/officeDocument/2006/relationships" xmlns:m="http://schemas.openxmlformats.org/officeDocument/2006/math" xmlns:v="urn:schemas-microsoft-com:vml" xmlns:wp14="http://schemas.microsoft.com/office/word/2010/wordprocessingDrawing" xmlns:wp="http://schemas.openxmlformats.org/drawingml/2006/wordprocessingDrawing" xmlns:w10="urn:schemas-microsoft-com:office:word" xmlns:w="http://schemas.openxmlformats.org/wordprocessingml/2006/main" xmlns:w14="http://schemas.microsoft.com/office/word/2010/wordml" xmlns:w15="http://schemas.microsoft.com/office/word/2012/wordml" xmlns:w16cex="http://schemas.microsoft.com/office/word/2018/wordml/cex" xmlns:w16cid="http://schemas.microsoft.com/office/word/2016/wordml/cid" xmlns:w16="http://schemas.microsoft.com/office/word/2018/wordml" xmlns:w16sdtdh="http://schemas.microsoft.com/office/word/2020/wordml/sdtdatahash" xmlns:w16se="http://schemas.microsoft.com/office/word/2015/wordml/symex" xmlns:wpg="http://schemas.microsoft.com/office/word/2010/wordprocessingGroup" xmlns:wpi="http://schemas.microsoft.com/office/word/2010/wordprocessingInk" xmlns:wne="http://schemas.microsoft.com/office/word/2006/wordml" xmlns:wps="http://schemas.microsoft.com/office/word/2010/wordprocessingShape" mc:Ignorable="w14 w15 w16se w16cid w16 w16cex w16sdtdh wp14">
+<w:numbering xmlns:wpc="http://schemas.microsoft.com/office/word/2010/wordprocessingCanvas" xmlns:cx="http://schemas.microsoft.com/office/drawing/2014/chartex" xmlns:cx1="http://schemas.microsoft.com/office/drawing/2015/9/8/chartex" xmlns:cx2="http://schemas.microsoft.com/office/drawing/2015/10/21/chartex" xmlns:cx3="http://schemas.microsoft.com/office/drawing/2016/5/9/chartex" xmlns:cx4="http://schemas.microsoft.com/office/drawing/2016/5/10/chartex" xmlns:cx5="http://schemas.microsoft.com/office/drawing/2016/5/11/chartex" xmlns:cx6="http://schemas.microsoft.com/office/drawing/2016/5/12/chartex" xmlns:cx7="http://schemas.microsoft.com/office/drawing/2016/5/13/chartex" xmlns:cx8="http://schemas.microsoft.com/office/drawing/2016/5/14/chartex" xmlns:mc="http://schemas.openxmlformats.org/markup-compatibility/2006" xmlns:m="http://schemas.openxmlformats.org/officeDocument/2006/math" xmlns:aink="http://schemas.microsoft.com/office/drawing/2016/ink" xmlns:am3d="http://schemas.microsoft.com/office/drawing/2017/model3d" xmlns:oel="http://schemas.microsoft.com/office/2019/extlst" xmlns:r="http://schemas.openxmlformats.org/officeDocument/2006/relationships" xmlns:wp14="http://schemas.microsoft.com/office/word/2010/wordprocessingDrawing" xmlns:wp="http://schemas.openxmlformats.org/drawingml/2006/wordprocessingDrawing" xmlns:wpg="http://schemas.microsoft.com/office/word/2010/wordprocessingGroup" xmlns:wpi="http://schemas.microsoft.com/office/word/2010/wordprocessingInk" xmlns:wps="http://schemas.microsoft.com/office/word/2010/wordprocessingShape" xmlns:o="urn:schemas-microsoft-com:office:office" xmlns:v="urn:schemas-microsoft-com:vml" xmlns:w10="urn:schemas-microsoft-com:office:word" xmlns:w="http://schemas.openxmlformats.org/wordprocessingml/2006/main" xmlns:w14="http://schemas.microsoft.com/office/word/2010/wordml" xmlns:w15="http://schemas.microsoft.com/office/word/2012/wordml" xmlns:w16cex="http://schemas.microsoft.com/office/word/2018/wordml/cex" xmlns:w16cid="http://schemas.microsoft.com/office/word/2016/wordml/cid" xmlns:w16="http://schemas.microsoft.com/office/word/2018/wordml" xmlns:w16sdtdh="http://schemas.microsoft.com/office/word/2020/wordml/sdtdatahash" xmlns:w16sdtfl="http://schemas.microsoft.com/office/word/2024/wordml/sdtformatlock" xmlns:w16se="http://schemas.microsoft.com/office/word/2015/wordml/symex" xmlns:w16du="http://schemas.microsoft.com/office/word/2023/wordml/word16du" xmlns:wne="http://schemas.microsoft.com/office/word/2006/wordml" mc:Ignorable="w14 w15 w16se w16cid w16 w16cex w16sdtdh w16sdtfl w16du wp14">
   <w:abstractNum w:abstractNumId="0" w15:restartNumberingAfterBreak="0">
     <w:nsid w:val="3FFE3326"/>
     <w:multiLevelType w:val="hybridMultilevel"/>
@@ -2300,41 +3100,41 @@
       </w:rPr>
     </w:lvl>
   </w:abstractNum>
-  <w:num w:numId="1">
+  <w:num w:numId="1" w16cid:durableId="1210730964">
     <w:abstractNumId w:val="9"/>
   </w:num>
-  <w:num w:numId="2">
+  <w:num w:numId="2" w16cid:durableId="913658898">
     <w:abstractNumId w:val="2"/>
   </w:num>
-  <w:num w:numId="3">
+  <w:num w:numId="3" w16cid:durableId="1539010627">
     <w:abstractNumId w:val="8"/>
   </w:num>
-  <w:num w:numId="4">
+  <w:num w:numId="4" w16cid:durableId="319965371">
     <w:abstractNumId w:val="7"/>
   </w:num>
-  <w:num w:numId="5">
+  <w:num w:numId="5" w16cid:durableId="1553421485">
     <w:abstractNumId w:val="4"/>
   </w:num>
-  <w:num w:numId="6">
+  <w:num w:numId="6" w16cid:durableId="1253394619">
     <w:abstractNumId w:val="1"/>
   </w:num>
-  <w:num w:numId="7">
+  <w:num w:numId="7" w16cid:durableId="317268038">
     <w:abstractNumId w:val="3"/>
   </w:num>
-  <w:num w:numId="8">
+  <w:num w:numId="8" w16cid:durableId="391466613">
     <w:abstractNumId w:val="6"/>
   </w:num>
-  <w:num w:numId="9">
+  <w:num w:numId="9" w16cid:durableId="1291324459">
     <w:abstractNumId w:val="0"/>
   </w:num>
-  <w:num w:numId="10">
+  <w:num w:numId="10" w16cid:durableId="131287368">
     <w:abstractNumId w:val="5"/>
   </w:num>
 </w:numbering>
 </file>
 
 <file path=word/styles.xml><?xml version="1.0" encoding="utf-8"?>
-<w:styles xmlns:mc="http://schemas.openxmlformats.org/markup-compatibility/2006" xmlns:r="http://schemas.openxmlformats.org/officeDocument/2006/relationships" xmlns:w="http://schemas.openxmlformats.org/wordprocessingml/2006/main" xmlns:w14="http://schemas.microsoft.com/office/word/2010/wordml" xmlns:w15="http://schemas.microsoft.com/office/word/2012/wordml" xmlns:w16cex="http://schemas.microsoft.com/office/word/2018/wordml/cex" xmlns:w16cid="http://schemas.microsoft.com/office/word/2016/wordml/cid" xmlns:w16="http://schemas.microsoft.com/office/word/2018/wordml" xmlns:w16sdtdh="http://schemas.microsoft.com/office/word/2020/wordml/sdtdatahash" xmlns:w16se="http://schemas.microsoft.com/office/word/2015/wordml/symex" mc:Ignorable="w14 w15 w16se w16cid w16 w16cex w16sdtdh">
+<w:styles xmlns:mc="http://schemas.openxmlformats.org/markup-compatibility/2006" xmlns:r="http://schemas.openxmlformats.org/officeDocument/2006/relationships" xmlns:w="http://schemas.openxmlformats.org/wordprocessingml/2006/main" xmlns:w14="http://schemas.microsoft.com/office/word/2010/wordml" xmlns:w15="http://schemas.microsoft.com/office/word/2012/wordml" xmlns:w16cex="http://schemas.microsoft.com/office/word/2018/wordml/cex" xmlns:w16cid="http://schemas.microsoft.com/office/word/2016/wordml/cid" xmlns:w16="http://schemas.microsoft.com/office/word/2018/wordml" xmlns:w16sdtdh="http://schemas.microsoft.com/office/word/2020/wordml/sdtdatahash" xmlns:w16sdtfl="http://schemas.microsoft.com/office/word/2024/wordml/sdtformatlock" xmlns:w16se="http://schemas.microsoft.com/office/word/2015/wordml/symex" xmlns:w16du="http://schemas.microsoft.com/office/word/2023/wordml/word16du" mc:Ignorable="w14 w15 w16se w16cid w16 w16cex w16sdtdh w16sdtfl w16du">
   <w:docDefaults>
     <w:rPrDefault>
       <w:rPr>
@@ -2456,6 +3256,7 @@
     <w:lsdException w:name="HTML Sample" w:semiHidden="1" w:unhideWhenUsed="1"/>
     <w:lsdException w:name="HTML Typewriter" w:semiHidden="1" w:unhideWhenUsed="1"/>
     <w:lsdException w:name="HTML Variable" w:semiHidden="1" w:unhideWhenUsed="1"/>
+    <w:lsdException w:name="Normal Table" w:semiHidden="1" w:unhideWhenUsed="1"/>
     <w:lsdException w:name="annotation subject" w:semiHidden="1" w:unhideWhenUsed="1"/>
     <w:lsdException w:name="No List" w:semiHidden="1" w:unhideWhenUsed="1"/>
     <w:lsdException w:name="Outline List 1" w:semiHidden="1" w:unhideWhenUsed="1"/>
@@ -2502,8 +3303,10 @@
     <w:lsdException w:name="Table Subtle 2" w:semiHidden="1" w:unhideWhenUsed="1"/>
     <w:lsdException w:name="Table Web 1" w:semiHidden="1" w:unhideWhenUsed="1"/>
     <w:lsdException w:name="Table Web 2" w:semiHidden="1" w:unhideWhenUsed="1"/>
+    <w:lsdException w:name="Table Web 3" w:semiHidden="1" w:unhideWhenUsed="1"/>
     <w:lsdException w:name="Balloon Text" w:semiHidden="1" w:unhideWhenUsed="1"/>
     <w:lsdException w:name="Table Grid" w:uiPriority="39"/>
+    <w:lsdException w:name="Table Theme" w:semiHidden="1" w:unhideWhenUsed="1"/>
     <w:lsdException w:name="Placeholder Text" w:semiHidden="1"/>
     <w:lsdException w:name="No Spacing" w:uiPriority="1" w:qFormat="1"/>
     <w:lsdException w:name="Light Shading" w:uiPriority="60"/>

</xml_diff>

<commit_message>
ordered sexual assault and stalking attachment fields in PDF tab order
</commit_message>
<xml_diff>
--- a/docassemble/PetitionForProtectiveOrderEfilingDemo/data/templates/protective_order_petition_next_steps.docx
+++ b/docassemble/PetitionForProtectiveOrderEfilingDemo/data/templates/protective_order_petition_next_steps.docx
@@ -1,34 +1,13 @@
 
 <file path=word/document.xml><?xml version="1.0" encoding="utf-8"?>
-<w:document xmlns:wpc="http://schemas.microsoft.com/office/word/2010/wordprocessingCanvas" xmlns:cx="http://schemas.microsoft.com/office/drawing/2014/chartex" xmlns:cx1="http://schemas.microsoft.com/office/drawing/2015/9/8/chartex" xmlns:cx2="http://schemas.microsoft.com/office/drawing/2015/10/21/chartex" xmlns:cx3="http://schemas.microsoft.com/office/drawing/2016/5/9/chartex" xmlns:cx4="http://schemas.microsoft.com/office/drawing/2016/5/10/chartex" xmlns:cx5="http://schemas.microsoft.com/office/drawing/2016/5/11/chartex" xmlns:cx6="http://schemas.microsoft.com/office/drawing/2016/5/12/chartex" xmlns:cx7="http://schemas.microsoft.com/office/drawing/2016/5/13/chartex" xmlns:cx8="http://schemas.microsoft.com/office/drawing/2016/5/14/chartex" xmlns:mc="http://schemas.openxmlformats.org/markup-compatibility/2006" xmlns:m="http://schemas.openxmlformats.org/officeDocument/2006/math" xmlns:aink="http://schemas.microsoft.com/office/drawing/2016/ink" xmlns:am3d="http://schemas.microsoft.com/office/drawing/2017/model3d" xmlns:oel="http://schemas.microsoft.com/office/2019/extlst" xmlns:r="http://schemas.openxmlformats.org/officeDocument/2006/relationships" xmlns:wp14="http://schemas.microsoft.com/office/word/2010/wordprocessingDrawing" xmlns:wp="http://schemas.openxmlformats.org/drawingml/2006/wordprocessingDrawing" xmlns:wpg="http://schemas.microsoft.com/office/word/2010/wordprocessingGroup" xmlns:wpi="http://schemas.microsoft.com/office/word/2010/wordprocessingInk" xmlns:wps="http://schemas.microsoft.com/office/word/2010/wordprocessingShape" xmlns:o="urn:schemas-microsoft-com:office:office" xmlns:v="urn:schemas-microsoft-com:vml" xmlns:w10="urn:schemas-microsoft-com:office:word" xmlns:w="http://schemas.openxmlformats.org/wordprocessingml/2006/main" xmlns:w14="http://schemas.microsoft.com/office/word/2010/wordml" xmlns:w15="http://schemas.microsoft.com/office/word/2012/wordml" xmlns:w16cex="http://schemas.microsoft.com/office/word/2018/wordml/cex" xmlns:w16cid="http://schemas.microsoft.com/office/word/2016/wordml/cid" xmlns:w16="http://schemas.microsoft.com/office/word/2018/wordml" xmlns:w16sdtdh="http://schemas.microsoft.com/office/word/2020/wordml/sdtdatahash" xmlns:w16sdtfl="http://schemas.microsoft.com/office/word/2024/wordml/sdtformatlock" xmlns:w16se="http://schemas.microsoft.com/office/word/2015/wordml/symex" xmlns:w16du="http://schemas.microsoft.com/office/word/2023/wordml/word16du" xmlns:wne="http://schemas.microsoft.com/office/word/2006/wordml" mc:Ignorable="w14 w15 w16se w16cid w16 w16cex w16sdtdh w16sdtfl w16du wp14">
+<w:document xmlns:wpc="http://schemas.microsoft.com/office/word/2010/wordprocessingCanvas" xmlns:cx="http://schemas.microsoft.com/office/drawing/2014/chartex" xmlns:cx1="http://schemas.microsoft.com/office/drawing/2015/9/8/chartex" xmlns:cx2="http://schemas.microsoft.com/office/drawing/2015/10/21/chartex" xmlns:cx3="http://schemas.microsoft.com/office/drawing/2016/5/9/chartex" xmlns:cx4="http://schemas.microsoft.com/office/drawing/2016/5/10/chartex" xmlns:cx5="http://schemas.microsoft.com/office/drawing/2016/5/11/chartex" xmlns:cx6="http://schemas.microsoft.com/office/drawing/2016/5/12/chartex" xmlns:cx7="http://schemas.microsoft.com/office/drawing/2016/5/13/chartex" xmlns:cx8="http://schemas.microsoft.com/office/drawing/2016/5/14/chartex" xmlns:mc="http://schemas.openxmlformats.org/markup-compatibility/2006" xmlns:aink="http://schemas.microsoft.com/office/drawing/2016/ink" xmlns:am3d="http://schemas.microsoft.com/office/drawing/2017/model3d" xmlns:o="urn:schemas-microsoft-com:office:office" xmlns:r="http://schemas.openxmlformats.org/officeDocument/2006/relationships" xmlns:m="http://schemas.openxmlformats.org/officeDocument/2006/math" xmlns:v="urn:schemas-microsoft-com:vml" xmlns:wp14="http://schemas.microsoft.com/office/word/2010/wordprocessingDrawing" xmlns:wp="http://schemas.openxmlformats.org/drawingml/2006/wordprocessingDrawing" xmlns:w10="urn:schemas-microsoft-com:office:word" xmlns:w="http://schemas.openxmlformats.org/wordprocessingml/2006/main" xmlns:w14="http://schemas.microsoft.com/office/word/2010/wordml" xmlns:w15="http://schemas.microsoft.com/office/word/2012/wordml" xmlns:w16cex="http://schemas.microsoft.com/office/word/2018/wordml/cex" xmlns:w16cid="http://schemas.microsoft.com/office/word/2016/wordml/cid" xmlns:w16="http://schemas.microsoft.com/office/word/2018/wordml" xmlns:w16sdtdh="http://schemas.microsoft.com/office/word/2020/wordml/sdtdatahash" xmlns:w16se="http://schemas.microsoft.com/office/word/2015/wordml/symex" xmlns:wpg="http://schemas.microsoft.com/office/word/2010/wordprocessingGroup" xmlns:wpi="http://schemas.microsoft.com/office/word/2010/wordprocessingInk" xmlns:wne="http://schemas.microsoft.com/office/word/2006/wordml" xmlns:wps="http://schemas.microsoft.com/office/word/2010/wordprocessingShape" mc:Ignorable="w14 w15 w16se w16cid w16 w16cex w16sdtdh wp14">
   <w:body>
     <w:p>
       <w:pPr>
         <w:pStyle w:val="Title1"/>
       </w:pPr>
-      <w:proofErr w:type="gramStart"/>
-      <w:r>
-        <w:t xml:space="preserve">{{ </w:t>
-      </w:r>
-      <w:proofErr w:type="spellStart"/>
-      <w:r>
-        <w:t>al</w:t>
-      </w:r>
-      <w:proofErr w:type="gramEnd"/>
-      <w:r>
-        <w:t>_next_steps_intro_</w:t>
-      </w:r>
-      <w:proofErr w:type="gramStart"/>
-      <w:r>
-        <w:t>prompt</w:t>
-      </w:r>
-      <w:proofErr w:type="spellEnd"/>
-      <w:r>
-        <w:t xml:space="preserve"> }</w:t>
-      </w:r>
-      <w:proofErr w:type="gramEnd"/>
-      <w:r>
-        <w:t>}</w:t>
+      <w:r>
+        <w:t>{{ al_next_steps_intro_prompt }}</w:t>
       </w:r>
     </w:p>
     <w:p>
@@ -45,223 +24,135 @@
       <w:r>
         <w:t xml:space="preserve">Congratulations </w:t>
       </w:r>
-      <w:proofErr w:type="gramStart"/>
+      <w:r>
+        <w:t>{_{</w:t>
+      </w:r>
+      <w:r>
+        <w:t xml:space="preserve"> users </w:t>
+      </w:r>
+      <w:r>
+        <w:t>}_}</w:t>
+      </w:r>
+      <w:r>
+        <w:t xml:space="preserve">! You have finished all the forms you need to </w:t>
+      </w:r>
       <w:r>
         <w:t>{{</w:t>
       </w:r>
       <w:r>
-        <w:t xml:space="preserve"> users</w:t>
-      </w:r>
-      <w:proofErr w:type="gramEnd"/>
-      <w:r>
         <w:t xml:space="preserve"> </w:t>
       </w:r>
       <w:r>
-        <w:t>}}</w:t>
-      </w:r>
-      <w:r>
-        <w:t xml:space="preserve">! You have finished all the forms you need to </w:t>
-      </w:r>
-      <w:proofErr w:type="gramStart"/>
-      <w:r>
-        <w:t>{{</w:t>
-      </w:r>
-      <w:r>
+        <w:t>al_next_s</w:t>
+      </w:r>
+      <w:r>
+        <w:t>t</w:t>
+      </w:r>
+      <w:r>
+        <w:t>eps_intro_pr</w:t>
+      </w:r>
+      <w:r>
+        <w:t>o</w:t>
+      </w:r>
+      <w:r>
+        <w:t>mp</w:t>
+      </w:r>
+      <w:r>
+        <w:t>t }}. The rest of the pages in this packet are y</w:t>
+      </w:r>
+      <w:r>
+        <w:t>our {{ showifd</w:t>
+      </w:r>
+      <w:r>
+        <w:t>ef("al_next_steps_document_title",</w:t>
+      </w:r>
+      <w:r>
+        <w:t>"application/petition/complaint") }}{_%</w:t>
+      </w:r>
+      <w:r>
+        <w:t>if</w:t>
+      </w:r>
+      <w:r>
+        <w:t xml:space="preserve"> other_parties.number() %_</w:t>
+      </w:r>
+      <w:r>
+        <w:t>} in</w:t>
+      </w:r>
+      <w:r>
+        <w:rPr>
+          <w:b/>
+        </w:rPr>
         <w:t xml:space="preserve"> </w:t>
       </w:r>
-      <w:proofErr w:type="spellStart"/>
-      <w:r>
-        <w:t>al</w:t>
-      </w:r>
-      <w:proofErr w:type="gramEnd"/>
-      <w:r>
-        <w:t>_next_s</w:t>
-      </w:r>
-      <w:r>
-        <w:t>t</w:t>
-      </w:r>
-      <w:r>
-        <w:t>eps_intro_</w:t>
-      </w:r>
-      <w:proofErr w:type="gramStart"/>
-      <w:r>
-        <w:t>pr</w:t>
-      </w:r>
-      <w:r>
-        <w:t>o</w:t>
-      </w:r>
-      <w:r>
-        <w:t>mp</w:t>
-      </w:r>
-      <w:r>
-        <w:t>t</w:t>
-      </w:r>
-      <w:proofErr w:type="spellEnd"/>
-      <w:r>
-        <w:t xml:space="preserve"> }</w:t>
-      </w:r>
-      <w:proofErr w:type="gramEnd"/>
-      <w:r>
-        <w:t>}. The rest of the pages in this packet are y</w:t>
-      </w:r>
-      <w:r>
-        <w:t xml:space="preserve">our </w:t>
-      </w:r>
-      <w:proofErr w:type="gramStart"/>
-      <w:r>
-        <w:t>{{ showifd</w:t>
-      </w:r>
-      <w:r>
-        <w:t>ef</w:t>
-      </w:r>
-      <w:proofErr w:type="gramEnd"/>
-      <w:r>
-        <w:t>("al_next_steps_document_title",</w:t>
-      </w:r>
-      <w:r>
-        <w:t>"application/petition/complaint"</w:t>
-      </w:r>
-      <w:proofErr w:type="gramStart"/>
-      <w:r>
-        <w:t>) }}{</w:t>
-      </w:r>
-      <w:proofErr w:type="gramEnd"/>
-      <w:r>
-        <w:t>%</w:t>
-      </w:r>
-      <w:r>
-        <w:t>if</w:t>
-      </w:r>
-      <w:r>
-        <w:t xml:space="preserve"> </w:t>
-      </w:r>
-      <w:proofErr w:type="spellStart"/>
-      <w:r>
-        <w:t>other_</w:t>
-      </w:r>
-      <w:proofErr w:type="gramStart"/>
-      <w:r>
-        <w:t>parties.number</w:t>
-      </w:r>
-      <w:proofErr w:type="spellEnd"/>
-      <w:proofErr w:type="gramEnd"/>
-      <w:r>
-        <w:t>() %</w:t>
-      </w:r>
-      <w:r>
-        <w:t>} in</w:t>
+      <w:r>
+        <w:t>{_</w:t>
       </w:r>
       <w:r>
         <w:rPr>
           <w:b/>
         </w:rPr>
-        <w:t xml:space="preserve"> </w:t>
-      </w:r>
-      <w:r>
         <w:t>{</w:t>
       </w:r>
       <w:r>
         <w:rPr>
           <w:b/>
         </w:rPr>
-        <w:t>{</w:t>
-      </w:r>
-      <w:proofErr w:type="gramStart"/>
+        <w:t>us</w:t>
+      </w:r>
       <w:r>
         <w:rPr>
           <w:b/>
         </w:rPr>
-        <w:t>us</w:t>
+        <w:t>ers }_}</w:t>
       </w:r>
       <w:r>
         <w:rPr>
           <w:b/>
         </w:rPr>
-        <w:t>ers }</w:t>
-      </w:r>
-      <w:proofErr w:type="gramEnd"/>
+        <w:t>v</w:t>
+      </w:r>
       <w:r>
         <w:rPr>
           <w:b/>
         </w:rPr>
-        <w:t>}</w:t>
+        <w:t>{_{</w:t>
       </w:r>
       <w:r>
         <w:rPr>
           <w:b/>
         </w:rPr>
-        <w:t xml:space="preserve"> </w:t>
+        <w:t>ot</w:t>
       </w:r>
       <w:r>
         <w:rPr>
           <w:b/>
         </w:rPr>
-        <w:t>v</w:t>
+        <w:t>her_parties }_}</w:t>
       </w:r>
       <w:r>
         <w:rPr>
           <w:b/>
         </w:rPr>
-        <w:t xml:space="preserve"> </w:t>
-      </w:r>
-      <w:r>
-        <w:rPr>
-          <w:b/>
-        </w:rPr>
-        <w:t>{{</w:t>
-      </w:r>
-      <w:proofErr w:type="spellStart"/>
-      <w:r>
-        <w:rPr>
-          <w:b/>
-        </w:rPr>
-        <w:t>ot</w:t>
-      </w:r>
-      <w:r>
-        <w:rPr>
-          <w:b/>
-        </w:rPr>
-        <w:t>her_</w:t>
-      </w:r>
-      <w:proofErr w:type="gramStart"/>
-      <w:r>
-        <w:rPr>
-          <w:b/>
-        </w:rPr>
-        <w:t>parties</w:t>
-      </w:r>
-      <w:proofErr w:type="spellEnd"/>
-      <w:r>
-        <w:rPr>
-          <w:b/>
-        </w:rPr>
-        <w:t xml:space="preserve"> }}</w:t>
-      </w:r>
-      <w:r>
-        <w:rPr>
-          <w:b/>
-        </w:rPr>
-        <w:t>{</w:t>
-      </w:r>
-      <w:proofErr w:type="gramEnd"/>
-      <w:r>
-        <w:rPr>
-          <w:b/>
-        </w:rPr>
-        <w:t>%</w:t>
+        <w:t>{_%</w:t>
       </w:r>
       <w:r>
         <w:t>en</w:t>
       </w:r>
       <w:r>
-        <w:t>dif %}</w:t>
+        <w:t>dif %_}</w:t>
       </w:r>
       <w:r>
         <w:t>.</w:t>
       </w:r>
     </w:p>
     <w:p>
-      <w:pPr>
+      <w:r>
+        <w:t>If you did not finish or you want to go back and change your answers to update your forms, use this QR code</w:t>
+      </w:r>
+      <w:r>
+        <w:br/>
+      </w:r>
+      <w:r>
         <w:rPr>
           <w:rFonts w:ascii="Cascadia Mono" w:hAnsi="Cascadia Mono" w:cs="Cascadia Mono"/>
           <w:color w:val="242424"/>
@@ -269,166 +160,7 @@
           <w:szCs w:val="21"/>
           <w:shd w:val="clear" w:color="auto" w:fill="FFFFFF"/>
         </w:rPr>
-      </w:pPr>
-      <w:r>
-        <w:t xml:space="preserve">If you did not finish or </w:t>
-      </w:r>
-      <w:proofErr w:type="gramStart"/>
-      <w:r>
-        <w:t>you want</w:t>
-      </w:r>
-      <w:proofErr w:type="gramEnd"/>
-      <w:r>
-        <w:t xml:space="preserve"> to go back and change your answers to update your forms, use this QR code</w:t>
-      </w:r>
-      <w:r>
-        <w:br/>
-      </w:r>
-    </w:p>
-    <w:p>
-      <w:r>
-        <w:rPr>
-          <w:rFonts w:ascii="Cascadia Mono" w:hAnsi="Cascadia Mono" w:cs="Cascadia Mono"/>
-          <w:color w:val="242424"/>
-          <w:sz w:val="21"/>
-          <w:szCs w:val="21"/>
-          <w:shd w:val="clear" w:color="auto" w:fill="FFFFFF"/>
-        </w:rPr>
-        <w:t>{{p</w:t>
-      </w:r>
-      <w:r>
-        <w:rPr>
-          <w:rFonts w:ascii="Cascadia Mono" w:hAnsi="Cascadia Mono" w:cs="Cascadia Mono"/>
-          <w:color w:val="242424"/>
-          <w:sz w:val="21"/>
-          <w:szCs w:val="21"/>
-          <w:shd w:val="clear" w:color="auto" w:fill="FFFFFF"/>
-        </w:rPr>
-        <w:t xml:space="preserve"> </w:t>
-      </w:r>
-      <w:proofErr w:type="spellStart"/>
-      <w:r>
-        <w:rPr>
-          <w:rFonts w:ascii="Cascadia Mono" w:hAnsi="Cascadia Mono" w:cs="Cascadia Mono"/>
-          <w:color w:val="242424"/>
-          <w:sz w:val="21"/>
-          <w:szCs w:val="21"/>
-          <w:shd w:val="clear" w:color="auto" w:fill="FFFFFF"/>
-        </w:rPr>
-        <w:t>qr_code</w:t>
-      </w:r>
-      <w:proofErr w:type="spellEnd"/>
-      <w:r>
-        <w:rPr>
-          <w:rFonts w:ascii="Cascadia Mono" w:hAnsi="Cascadia Mono" w:cs="Cascadia Mono"/>
-          <w:color w:val="242424"/>
-          <w:sz w:val="21"/>
-          <w:szCs w:val="21"/>
-          <w:shd w:val="clear" w:color="auto" w:fill="FFFFFF"/>
-        </w:rPr>
-        <w:t>(</w:t>
-      </w:r>
-      <w:proofErr w:type="spellStart"/>
-      <w:r>
-        <w:rPr>
-          <w:rFonts w:ascii="Cascadia Mono" w:hAnsi="Cascadia Mono" w:cs="Cascadia Mono"/>
-          <w:color w:val="242424"/>
-          <w:sz w:val="21"/>
-          <w:szCs w:val="21"/>
-          <w:shd w:val="clear" w:color="auto" w:fill="FFFFFF"/>
-        </w:rPr>
-        <w:t>interview_url</w:t>
-      </w:r>
-      <w:proofErr w:type="spellEnd"/>
-      <w:r>
-        <w:rPr>
-          <w:rFonts w:ascii="Cascadia Mono" w:hAnsi="Cascadia Mono" w:cs="Cascadia Mono"/>
-          <w:color w:val="242424"/>
-          <w:sz w:val="21"/>
-          <w:szCs w:val="21"/>
-          <w:shd w:val="clear" w:color="auto" w:fill="FFFFFF"/>
-        </w:rPr>
-        <w:t>(</w:t>
-      </w:r>
-      <w:r>
-        <w:rPr>
-          <w:rFonts w:ascii="Cascadia Mono" w:hAnsi="Cascadia Mono" w:cs="Cascadia Mono"/>
-          <w:color w:val="242424"/>
-          <w:sz w:val="21"/>
-          <w:szCs w:val="21"/>
-          <w:shd w:val="clear" w:color="auto" w:fill="FFFFFF"/>
-        </w:rPr>
-        <w:t>), width=</w:t>
-      </w:r>
-      <w:r>
-        <w:rPr>
-          <w:rFonts w:ascii="Cascadia Mono" w:hAnsi="Cascadia Mono" w:cs="Cascadia Mono"/>
-          <w:color w:val="242424"/>
-          <w:sz w:val="21"/>
-          <w:szCs w:val="21"/>
-          <w:shd w:val="clear" w:color="auto" w:fill="FFFFFF"/>
-        </w:rPr>
-        <w:t>”</w:t>
-      </w:r>
-      <w:r>
-        <w:rPr>
-          <w:rFonts w:ascii="Cascadia Mono" w:hAnsi="Cascadia Mono" w:cs="Cascadia Mono"/>
-          <w:color w:val="242424"/>
-          <w:sz w:val="21"/>
-          <w:szCs w:val="21"/>
-          <w:shd w:val="clear" w:color="auto" w:fill="FFFFFF"/>
-        </w:rPr>
-        <w:t>200px</w:t>
-      </w:r>
-      <w:r>
-        <w:rPr>
-          <w:rFonts w:ascii="Cascadia Mono" w:hAnsi="Cascadia Mono" w:cs="Cascadia Mono"/>
-          <w:color w:val="242424"/>
-          <w:sz w:val="21"/>
-          <w:szCs w:val="21"/>
-          <w:shd w:val="clear" w:color="auto" w:fill="FFFFFF"/>
-        </w:rPr>
-        <w:t>”</w:t>
-      </w:r>
-      <w:r>
-        <w:rPr>
-          <w:rFonts w:ascii="Cascadia Mono" w:hAnsi="Cascadia Mono" w:cs="Cascadia Mono"/>
-          <w:color w:val="242424"/>
-          <w:sz w:val="21"/>
-          <w:szCs w:val="21"/>
-          <w:shd w:val="clear" w:color="auto" w:fill="FFFFFF"/>
-        </w:rPr>
-        <w:t>)</w:t>
-      </w:r>
-      <w:r>
-        <w:rPr>
-          <w:rFonts w:ascii="Cascadia Mono" w:hAnsi="Cascadia Mono" w:cs="Cascadia Mono"/>
-          <w:color w:val="242424"/>
-          <w:sz w:val="21"/>
-          <w:szCs w:val="21"/>
-          <w:shd w:val="clear" w:color="auto" w:fill="FFFFFF"/>
-        </w:rPr>
-        <w:t xml:space="preserve"> | markdown</w:t>
-      </w:r>
-      <w:r>
-        <w:rPr>
-          <w:rFonts w:ascii="Cascadia Mono" w:hAnsi="Cascadia Mono" w:cs="Cascadia Mono"/>
-          <w:color w:val="242424"/>
-          <w:sz w:val="21"/>
-          <w:szCs w:val="21"/>
-          <w:shd w:val="clear" w:color="auto" w:fill="FFFFFF"/>
-        </w:rPr>
-        <w:t xml:space="preserve"> </w:t>
-      </w:r>
-      <w:r>
-        <w:rPr>
-          <w:rFonts w:ascii="Cascadia Mono" w:hAnsi="Cascadia Mono" w:cs="Cascadia Mono"/>
-          <w:color w:val="242424"/>
-          <w:sz w:val="21"/>
-          <w:szCs w:val="21"/>
-          <w:shd w:val="clear" w:color="auto" w:fill="FFFFFF"/>
-        </w:rPr>
-        <w:t>}}</w:t>
+        <w:t>{{ qr_code(interview_url()) }}</w:t>
       </w:r>
     </w:p>
     <w:p>
@@ -488,37 +220,14 @@
         </w:rPr>
         <w:t xml:space="preserve">File this </w:t>
       </w:r>
-      <w:proofErr w:type="gramStart"/>
-      <w:r>
-        <w:t xml:space="preserve">{{ </w:t>
-      </w:r>
-      <w:proofErr w:type="spellStart"/>
-      <w:r>
-        <w:t>showifdef</w:t>
-      </w:r>
-      <w:proofErr w:type="spellEnd"/>
-      <w:proofErr w:type="gramEnd"/>
-      <w:r>
-        <w:t>("</w:t>
-      </w:r>
-      <w:proofErr w:type="spellStart"/>
-      <w:r>
-        <w:t>al_next_steps_document_title</w:t>
-      </w:r>
-      <w:proofErr w:type="spellEnd"/>
-      <w:r>
-        <w:t>", "app</w:t>
-      </w:r>
-      <w:r>
-        <w:t>lication/petition/complaint"</w:t>
-      </w:r>
-      <w:proofErr w:type="gramStart"/>
-      <w:r>
-        <w:t>) }</w:t>
-      </w:r>
-      <w:proofErr w:type="gramEnd"/>
-      <w:r>
-        <w:t>} with th</w:t>
+      <w:r>
+        <w:t>{{ showifdef("</w:t>
+      </w:r>
+      <w:r>
+        <w:t>al_next_steps_document_title", "app</w:t>
+      </w:r>
+      <w:r>
+        <w:t>lication/petition/complaint") }} with th</w:t>
       </w:r>
       <w:r>
         <w:t>e court now.</w:t>
@@ -551,7 +260,6 @@
         </w:rPr>
         <w:t xml:space="preserve">Deliver a copy to </w:t>
       </w:r>
-      <w:proofErr w:type="gramStart"/>
       <w:r>
         <w:rPr>
           <w14:textOutline w14:w="9525" w14:cap="rnd" w14:cmpd="sng" w14:algn="ctr">
@@ -560,7 +268,7 @@
             <w14:bevel/>
           </w14:textOutline>
         </w:rPr>
-        <w:t>{{</w:t>
+        <w:t>{_{</w:t>
       </w:r>
       <w:r>
         <w:rPr>
@@ -570,9 +278,8 @@
             <w14:bevel/>
           </w14:textOutline>
         </w:rPr>
-        <w:t xml:space="preserve"> </w:t>
-      </w:r>
-      <w:proofErr w:type="spellStart"/>
+        <w:t xml:space="preserve"> showifdef('other_parties[0]') </w:t>
+      </w:r>
       <w:r>
         <w:rPr>
           <w14:textOutline w14:w="9525" w14:cap="rnd" w14:cmpd="sng" w14:algn="ctr">
@@ -581,95 +288,7 @@
             <w14:bevel/>
           </w14:textOutline>
         </w:rPr>
-        <w:t>showifdef</w:t>
-      </w:r>
-      <w:proofErr w:type="spellEnd"/>
-      <w:proofErr w:type="gramEnd"/>
-      <w:r>
-        <w:rPr>
-          <w14:textOutline w14:w="9525" w14:cap="rnd" w14:cmpd="sng" w14:algn="ctr">
-            <w14:noFill/>
-            <w14:prstDash w14:val="solid"/>
-            <w14:bevel/>
-          </w14:textOutline>
-        </w:rPr>
-        <w:t>('</w:t>
-      </w:r>
-      <w:proofErr w:type="spellStart"/>
-      <w:r>
-        <w:rPr>
-          <w14:textOutline w14:w="9525" w14:cap="rnd" w14:cmpd="sng" w14:algn="ctr">
-            <w14:noFill/>
-            <w14:prstDash w14:val="solid"/>
-            <w14:bevel/>
-          </w14:textOutline>
-        </w:rPr>
-        <w:t>other_</w:t>
-      </w:r>
-      <w:proofErr w:type="gramStart"/>
-      <w:r>
-        <w:rPr>
-          <w14:textOutline w14:w="9525" w14:cap="rnd" w14:cmpd="sng" w14:algn="ctr">
-            <w14:noFill/>
-            <w14:prstDash w14:val="solid"/>
-            <w14:bevel/>
-          </w14:textOutline>
-        </w:rPr>
-        <w:t>parties</w:t>
-      </w:r>
-      <w:proofErr w:type="spellEnd"/>
-      <w:r>
-        <w:rPr>
-          <w14:textOutline w14:w="9525" w14:cap="rnd" w14:cmpd="sng" w14:algn="ctr">
-            <w14:noFill/>
-            <w14:prstDash w14:val="solid"/>
-            <w14:bevel/>
-          </w14:textOutline>
-        </w:rPr>
-        <w:t>[</w:t>
-      </w:r>
-      <w:proofErr w:type="gramEnd"/>
-      <w:r>
-        <w:rPr>
-          <w14:textOutline w14:w="9525" w14:cap="rnd" w14:cmpd="sng" w14:algn="ctr">
-            <w14:noFill/>
-            <w14:prstDash w14:val="solid"/>
-            <w14:bevel/>
-          </w14:textOutline>
-        </w:rPr>
-        <w:t>0]'</w:t>
-      </w:r>
-      <w:proofErr w:type="gramStart"/>
-      <w:r>
-        <w:rPr>
-          <w14:textOutline w14:w="9525" w14:cap="rnd" w14:cmpd="sng" w14:algn="ctr">
-            <w14:noFill/>
-            <w14:prstDash w14:val="solid"/>
-            <w14:bevel/>
-          </w14:textOutline>
-        </w:rPr>
-        <w:t xml:space="preserve">) </w:t>
-      </w:r>
-      <w:r>
-        <w:rPr>
-          <w14:textOutline w14:w="9525" w14:cap="rnd" w14:cmpd="sng" w14:algn="ctr">
-            <w14:noFill/>
-            <w14:prstDash w14:val="solid"/>
-            <w14:bevel/>
-          </w14:textOutline>
-        </w:rPr>
-        <w:t>}</w:t>
-      </w:r>
-      <w:proofErr w:type="gramEnd"/>
-      <w:r>
-        <w:rPr>
-          <w14:textOutline w14:w="9525" w14:cap="rnd" w14:cmpd="sng" w14:algn="ctr">
-            <w14:noFill/>
-            <w14:prstDash w14:val="solid"/>
-            <w14:bevel/>
-          </w14:textOutline>
-        </w:rPr>
-        <w:t>}</w:t>
+        <w:t>}_}</w:t>
       </w:r>
       <w:r>
         <w:rPr>
@@ -769,32 +388,15 @@
         </w:rPr>
         <w:t xml:space="preserve">If the judge decides to grant your </w:t>
       </w:r>
-      <w:proofErr w:type="gramStart"/>
-      <w:r>
-        <w:t xml:space="preserve">{{ </w:t>
-      </w:r>
-      <w:proofErr w:type="spellStart"/>
-      <w:r>
-        <w:t>showifdef</w:t>
-      </w:r>
-      <w:proofErr w:type="spellEnd"/>
-      <w:proofErr w:type="gramEnd"/>
-      <w:r>
-        <w:t>("</w:t>
-      </w:r>
-      <w:proofErr w:type="spellStart"/>
+      <w:r>
+        <w:t>{{ showifdef("</w:t>
+      </w:r>
       <w:r>
         <w:t>al_next_steps_document_purpose</w:t>
       </w:r>
-      <w:proofErr w:type="spellEnd"/>
-      <w:r>
-        <w:t>", "application/petition/complaint"</w:t>
-      </w:r>
-      <w:proofErr w:type="gramStart"/>
-      <w:r>
-        <w:t>) }}:.</w:t>
-      </w:r>
-      <w:proofErr w:type="gramEnd"/>
+      <w:r>
+        <w:t>", "application/petition/complaint") }}:.</w:t>
+      </w:r>
     </w:p>
     <w:p>
       <w:pPr>
@@ -858,47 +460,25 @@
         <w:t xml:space="preserve">Call the </w:t>
       </w:r>
       <w:r>
-        <w:t xml:space="preserve">court </w:t>
-      </w:r>
-      <w:proofErr w:type="gramStart"/>
-      <w:r>
-        <w:t xml:space="preserve">{{ </w:t>
-      </w:r>
-      <w:proofErr w:type="spellStart"/>
-      <w:r>
-        <w:t>showifdef</w:t>
-      </w:r>
-      <w:proofErr w:type="spellEnd"/>
-      <w:proofErr w:type="gramEnd"/>
-      <w:r>
-        <w:t>('</w:t>
-      </w:r>
-      <w:proofErr w:type="spellStart"/>
-      <w:r>
-        <w:t>trial_</w:t>
-      </w:r>
-      <w:proofErr w:type="gramStart"/>
-      <w:r>
-        <w:t>court.phone</w:t>
-      </w:r>
-      <w:proofErr w:type="gramEnd"/>
-      <w:r>
-        <w:t>_number</w:t>
-      </w:r>
-      <w:proofErr w:type="spellEnd"/>
-      <w:r>
-        <w:t>'</w:t>
-      </w:r>
-      <w:proofErr w:type="gramStart"/>
-      <w:r>
-        <w:t xml:space="preserve">) </w:t>
-      </w:r>
-      <w:r>
-        <w:t>}</w:t>
-      </w:r>
-      <w:proofErr w:type="gramEnd"/>
-      <w:r>
-        <w:t>}</w:t>
+        <w:t xml:space="preserve">{_{ </w:t>
+      </w:r>
+      <w:r>
+        <w:t xml:space="preserve">trial_court </w:t>
+      </w:r>
+      <w:r>
+        <w:t>}_}</w:t>
+      </w:r>
+      <w:r>
+        <w:t xml:space="preserve"> </w:t>
+      </w:r>
+      <w:r>
+        <w:t xml:space="preserve">{_{ </w:t>
+      </w:r>
+      <w:r>
+        <w:t xml:space="preserve">showifdef('trial_court.phone_number') </w:t>
+      </w:r>
+      <w:r>
+        <w:t>}_}</w:t>
       </w:r>
       <w:r>
         <w:t xml:space="preserve"> to find out how they want you to send your forms to them.</w:t>
@@ -913,29 +493,13 @@
         </w:numPr>
       </w:pPr>
       <w:r>
-        <w:t>{%</w:t>
-      </w:r>
-      <w:r>
-        <w:t>p if defined('</w:t>
-      </w:r>
-      <w:proofErr w:type="spellStart"/>
-      <w:r>
-        <w:t>trial_</w:t>
-      </w:r>
-      <w:proofErr w:type="gramStart"/>
-      <w:r>
-        <w:t>court.address</w:t>
-      </w:r>
-      <w:proofErr w:type="gramEnd"/>
-      <w:r>
-        <w:t>.address</w:t>
-      </w:r>
-      <w:proofErr w:type="spellEnd"/>
-      <w:r>
-        <w:t xml:space="preserve">') </w:t>
-      </w:r>
-      <w:r>
-        <w:t>%}</w:t>
+        <w:t>{_%</w:t>
+      </w:r>
+      <w:r>
+        <w:t xml:space="preserve">p if defined('trial_court.address.address') </w:t>
+      </w:r>
+      <w:r>
+        <w:t>%_}</w:t>
       </w:r>
       <w:r>
         <w:t xml:space="preserve"> The address of your court, if you need it, is: </w:t>
@@ -945,40 +509,14 @@
       <w:r>
         <w:br/>
       </w:r>
-      <w:proofErr w:type="gramStart"/>
-      <w:r>
-        <w:t xml:space="preserve">{{ </w:t>
-      </w:r>
-      <w:proofErr w:type="spellStart"/>
-      <w:r>
-        <w:t>trial</w:t>
-      </w:r>
-      <w:proofErr w:type="gramEnd"/>
-      <w:r>
-        <w:t>_</w:t>
-      </w:r>
-      <w:proofErr w:type="gramStart"/>
-      <w:r>
-        <w:t>court.address</w:t>
-      </w:r>
-      <w:proofErr w:type="gramEnd"/>
-      <w:r>
-        <w:t>.on_one_</w:t>
-      </w:r>
-      <w:proofErr w:type="gramStart"/>
-      <w:r>
-        <w:t>line</w:t>
-      </w:r>
-      <w:proofErr w:type="spellEnd"/>
-      <w:r>
-        <w:t xml:space="preserve">() </w:t>
-      </w:r>
-      <w:r>
-        <w:t>}</w:t>
-      </w:r>
-      <w:proofErr w:type="gramEnd"/>
-      <w:r>
-        <w:t>}</w:t>
+      <w:r>
+        <w:t xml:space="preserve">{_{ </w:t>
+      </w:r>
+      <w:r>
+        <w:t xml:space="preserve">trial_court.address.on_one_line() </w:t>
+      </w:r>
+      <w:r>
+        <w:t>}_}</w:t>
       </w:r>
       <w:r>
         <w:t>.</w:t>
@@ -993,13 +531,13 @@
         </w:numPr>
       </w:pPr>
       <w:r>
-        <w:t xml:space="preserve">{%p </w:t>
+        <w:t xml:space="preserve">{_%p </w:t>
       </w:r>
       <w:r>
         <w:t xml:space="preserve">endif </w:t>
       </w:r>
       <w:r>
-        <w:t>%}</w:t>
+        <w:t>%_}</w:t>
       </w:r>
     </w:p>
     <w:p>
@@ -1021,73 +559,37 @@
           <w:rFonts w:ascii="Arial" w:hAnsi="Arial" w:cs="Arial"/>
         </w:rPr>
       </w:pPr>
-      <w:proofErr w:type="gramStart"/>
       <w:r>
         <w:rPr>
           <w:rFonts w:ascii="Arial" w:hAnsi="Arial" w:cs="Arial"/>
         </w:rPr>
-        <w:t>{{</w:t>
+        <w:t>{_{</w:t>
       </w:r>
       <w:r>
         <w:rPr>
           <w:rFonts w:ascii="Arial" w:hAnsi="Arial" w:cs="Arial"/>
         </w:rPr>
-        <w:t xml:space="preserve"> </w:t>
-      </w:r>
-      <w:proofErr w:type="spellStart"/>
+        <w:t xml:space="preserve"> other_parties </w:t>
+      </w:r>
       <w:r>
         <w:rPr>
           <w:rFonts w:ascii="Arial" w:hAnsi="Arial" w:cs="Arial"/>
         </w:rPr>
-        <w:t>other</w:t>
-      </w:r>
-      <w:proofErr w:type="gramEnd"/>
+        <w:t>}_}</w:t>
+      </w:r>
       <w:r>
         <w:rPr>
           <w:rFonts w:ascii="Arial" w:hAnsi="Arial" w:cs="Arial"/>
         </w:rPr>
-        <w:t>_</w:t>
-      </w:r>
-      <w:proofErr w:type="gramStart"/>
-      <w:r>
+        <w:t xml:space="preserve"> must get a copy of this form. Deliver a copy by hand, mail, or electronic filing.</w:t>
+      </w:r>
+    </w:p>
+    <w:p>
+      <w:pPr>
+        <w:pStyle w:val="NumberedList"/>
         <w:rPr>
           <w:rFonts w:ascii="Arial" w:hAnsi="Arial" w:cs="Arial"/>
         </w:rPr>
-        <w:t>parties</w:t>
-      </w:r>
-      <w:proofErr w:type="spellEnd"/>
-      <w:r>
-        <w:rPr>
-          <w:rFonts w:ascii="Arial" w:hAnsi="Arial" w:cs="Arial"/>
-        </w:rPr>
-        <w:t xml:space="preserve"> </w:t>
-      </w:r>
-      <w:r>
-        <w:rPr>
-          <w:rFonts w:ascii="Arial" w:hAnsi="Arial" w:cs="Arial"/>
-        </w:rPr>
-        <w:t>}</w:t>
-      </w:r>
-      <w:proofErr w:type="gramEnd"/>
-      <w:r>
-        <w:rPr>
-          <w:rFonts w:ascii="Arial" w:hAnsi="Arial" w:cs="Arial"/>
-        </w:rPr>
-        <w:t>}</w:t>
-      </w:r>
-      <w:r>
-        <w:rPr>
-          <w:rFonts w:ascii="Arial" w:hAnsi="Arial" w:cs="Arial"/>
-        </w:rPr>
-        <w:t xml:space="preserve"> must get a copy of this form. Deliver a copy by hand, mail, or electronic filing.</w:t>
-      </w:r>
-    </w:p>
-    <w:p>
-      <w:pPr>
-        <w:pStyle w:val="NumberedList"/>
-        <w:rPr>
-          <w:rFonts w:ascii="Arial" w:hAnsi="Arial" w:cs="Arial"/>
-        </w:rPr>
       </w:pPr>
     </w:p>
     <w:p>
@@ -1105,32 +607,16 @@
     </w:p>
     <w:p>
       <w:r>
-        <w:t>{%p</w:t>
-      </w:r>
-      <w:r>
-        <w:t xml:space="preserve"> if </w:t>
-      </w:r>
-      <w:proofErr w:type="spellStart"/>
-      <w:r>
-        <w:t>al_next_steps_enabled</w:t>
-      </w:r>
-      <w:proofErr w:type="spellEnd"/>
-      <w:r>
-        <w:t xml:space="preserve"> and </w:t>
-      </w:r>
-      <w:proofErr w:type="spellStart"/>
-      <w:r>
-        <w:t>al_n</w:t>
+        <w:t xml:space="preserve">{%p if </w:t>
+      </w:r>
+      <w:r>
+        <w:t>al_next_steps_enabled and al_n</w:t>
       </w:r>
       <w:r>
         <w:t>ext_s</w:t>
       </w:r>
       <w:r>
-        <w:t>teps_what_happens_next</w:t>
-      </w:r>
-      <w:proofErr w:type="spellEnd"/>
-      <w:r>
-        <w:t xml:space="preserve"> %}</w:t>
+        <w:t>teps_what_happens_next %}</w:t>
       </w:r>
     </w:p>
     <w:p>
@@ -1145,18 +631,8 @@
       <w:r>
         <w:t xml:space="preserve">{%p for line in </w:t>
       </w:r>
-      <w:proofErr w:type="spellStart"/>
-      <w:r>
-        <w:t>al_next_steps_what_happens_</w:t>
-      </w:r>
-      <w:proofErr w:type="gramStart"/>
-      <w:r>
-        <w:t>next.split</w:t>
-      </w:r>
-      <w:proofErr w:type="spellEnd"/>
-      <w:proofErr w:type="gramEnd"/>
-      <w:r>
-        <w:t>("\n") %}</w:t>
+      <w:r>
+        <w:t>al_next_steps_what_happens_next.split("\n") %}</w:t>
       </w:r>
     </w:p>
     <w:p>
@@ -1168,29 +644,8 @@
         </w:numPr>
         <w:ind w:left="360"/>
       </w:pPr>
-      <w:proofErr w:type="gramStart"/>
-      <w:r>
-        <w:t xml:space="preserve">{{ </w:t>
-      </w:r>
-      <w:proofErr w:type="spellStart"/>
-      <w:r>
-        <w:t>fix</w:t>
-      </w:r>
-      <w:proofErr w:type="gramEnd"/>
-      <w:r>
-        <w:t>_punctuation</w:t>
-      </w:r>
-      <w:proofErr w:type="spellEnd"/>
-      <w:r>
-        <w:t>(line</w:t>
-      </w:r>
-      <w:proofErr w:type="gramStart"/>
-      <w:r>
-        <w:t>) }</w:t>
-      </w:r>
-      <w:proofErr w:type="gramEnd"/>
-      <w:r>
-        <w:t>}</w:t>
+      <w:r>
+        <w:t>{{ fix_punctuation(line) }}</w:t>
       </w:r>
     </w:p>
     <w:p>
@@ -1203,15 +658,7 @@
         <w:ind w:left="360"/>
       </w:pPr>
       <w:r>
-        <w:t xml:space="preserve">{%p </w:t>
-      </w:r>
-      <w:proofErr w:type="spellStart"/>
-      <w:r>
-        <w:t>endfor</w:t>
-      </w:r>
-      <w:proofErr w:type="spellEnd"/>
-      <w:r>
-        <w:t xml:space="preserve"> %}</w:t>
+        <w:t>{%p endfor %}</w:t>
       </w:r>
     </w:p>
     <w:p>
@@ -1227,34 +674,13 @@
         <w:t>Tell</w:t>
       </w:r>
       <w:r>
-        <w:t xml:space="preserve"> the judge why you need a </w:t>
-      </w:r>
-      <w:proofErr w:type="gramStart"/>
-      <w:r>
-        <w:t xml:space="preserve">{{ </w:t>
-      </w:r>
-      <w:proofErr w:type="spellStart"/>
-      <w:r>
-        <w:t>al</w:t>
-      </w:r>
-      <w:proofErr w:type="gramEnd"/>
-      <w:r>
-        <w:t>_next_steps_</w:t>
-      </w:r>
-      <w:proofErr w:type="gramStart"/>
-      <w:r>
-        <w:t>t</w:t>
-      </w:r>
-      <w:r>
-        <w:t>itle</w:t>
-      </w:r>
-      <w:proofErr w:type="spellEnd"/>
-      <w:r>
-        <w:t xml:space="preserve"> }</w:t>
-      </w:r>
-      <w:proofErr w:type="gramEnd"/>
-      <w:r>
-        <w:t>}. Talk about the facts that you wrote in your complaint. Tell the judge about any evidence that you have.</w:t>
+        <w:t xml:space="preserve"> the judge why you need a {{ </w:t>
+      </w:r>
+      <w:r>
+        <w:t>al_next_steps_t</w:t>
+      </w:r>
+      <w:r>
+        <w:t>itle }}. Talk about the facts that you wrote in your complaint. Tell the judge about any evidence that you have.</w:t>
       </w:r>
     </w:p>
     <w:p>
@@ -1274,27 +700,14 @@
       <w:r>
         <w:t xml:space="preserve">{%p if </w:t>
       </w:r>
-      <w:proofErr w:type="spellStart"/>
-      <w:r>
-        <w:t>al_next_steps_enabled</w:t>
-      </w:r>
-      <w:proofErr w:type="spellEnd"/>
-      <w:r>
-        <w:t xml:space="preserve"> and </w:t>
-      </w:r>
-      <w:proofErr w:type="spellStart"/>
-      <w:r>
-        <w:t>al_n</w:t>
+      <w:r>
+        <w:t>al_next_steps_enabled and al_n</w:t>
       </w:r>
       <w:r>
         <w:t>ext_s</w:t>
       </w:r>
       <w:r>
-        <w:t>teps_what_can_decision_maker_do</w:t>
-      </w:r>
-      <w:proofErr w:type="spellEnd"/>
-      <w:r>
-        <w:t xml:space="preserve"> %}</w:t>
+        <w:t>teps_what_can_decision_maker_do %}</w:t>
       </w:r>
     </w:p>
     <w:p>
@@ -1309,18 +722,8 @@
       <w:r>
         <w:t xml:space="preserve">{%p for line in </w:t>
       </w:r>
-      <w:proofErr w:type="spellStart"/>
-      <w:r>
-        <w:t>al_next_steps_what_can_decision_maker_</w:t>
-      </w:r>
-      <w:proofErr w:type="gramStart"/>
-      <w:r>
-        <w:t>do.split</w:t>
-      </w:r>
-      <w:proofErr w:type="spellEnd"/>
-      <w:proofErr w:type="gramEnd"/>
-      <w:r>
-        <w:t>("\n") %}</w:t>
+      <w:r>
+        <w:t>al_next_steps_what_can_decision_maker_do.split("\n") %}</w:t>
       </w:r>
     </w:p>
     <w:p>
@@ -1332,29 +735,8 @@
         </w:numPr>
         <w:ind w:left="360"/>
       </w:pPr>
-      <w:proofErr w:type="gramStart"/>
-      <w:r>
-        <w:t xml:space="preserve">{{ </w:t>
-      </w:r>
-      <w:proofErr w:type="spellStart"/>
-      <w:r>
-        <w:t>fix</w:t>
-      </w:r>
-      <w:proofErr w:type="gramEnd"/>
-      <w:r>
-        <w:t>_punctuation</w:t>
-      </w:r>
-      <w:proofErr w:type="spellEnd"/>
-      <w:r>
-        <w:t>(line</w:t>
-      </w:r>
-      <w:proofErr w:type="gramStart"/>
-      <w:r>
-        <w:t>) }</w:t>
-      </w:r>
-      <w:proofErr w:type="gramEnd"/>
-      <w:r>
-        <w:t>}</w:t>
+      <w:r>
+        <w:t>{{ fix_punctuation(line) }}</w:t>
       </w:r>
     </w:p>
     <w:p>
@@ -1367,15 +749,7 @@
         <w:ind w:left="360"/>
       </w:pPr>
       <w:r>
-        <w:t xml:space="preserve">{%p </w:t>
-      </w:r>
-      <w:proofErr w:type="spellStart"/>
-      <w:r>
-        <w:t>endfor</w:t>
-      </w:r>
-      <w:proofErr w:type="spellEnd"/>
-      <w:r>
-        <w:t xml:space="preserve"> %}</w:t>
+        <w:t>{%p endfor %}</w:t>
       </w:r>
     </w:p>
     <w:p>
@@ -1400,27 +774,14 @@
       <w:r>
         <w:t xml:space="preserve">{%p if </w:t>
       </w:r>
-      <w:proofErr w:type="spellStart"/>
-      <w:r>
-        <w:t>al_next_steps_enabled</w:t>
-      </w:r>
-      <w:proofErr w:type="spellEnd"/>
-      <w:r>
-        <w:t xml:space="preserve"> and </w:t>
-      </w:r>
-      <w:proofErr w:type="spellStart"/>
-      <w:r>
-        <w:t>al_n</w:t>
+      <w:r>
+        <w:t>al_next_steps_enabled and al_n</w:t>
       </w:r>
       <w:r>
         <w:t>ext_s</w:t>
       </w:r>
       <w:r>
-        <w:t>teps_what_can_decision_maker_do</w:t>
-      </w:r>
-      <w:proofErr w:type="spellEnd"/>
-      <w:r>
-        <w:t xml:space="preserve"> %}</w:t>
+        <w:t>teps_what_can_decision_maker_do %}</w:t>
       </w:r>
     </w:p>
     <w:p>
@@ -1435,18 +796,8 @@
       <w:r>
         <w:t xml:space="preserve">{%p for line in </w:t>
       </w:r>
-      <w:proofErr w:type="spellStart"/>
-      <w:r>
-        <w:t>al_next_steps_what_happens_if_i_</w:t>
-      </w:r>
-      <w:proofErr w:type="gramStart"/>
-      <w:r>
-        <w:t>win.split</w:t>
-      </w:r>
-      <w:proofErr w:type="spellEnd"/>
-      <w:proofErr w:type="gramEnd"/>
-      <w:r>
-        <w:t>("\n") %}</w:t>
+      <w:r>
+        <w:t>al_next_steps_what_happens_if_i_win.split("\n") %}</w:t>
       </w:r>
     </w:p>
     <w:p>
@@ -1458,29 +809,8 @@
         </w:numPr>
         <w:ind w:left="360"/>
       </w:pPr>
-      <w:proofErr w:type="gramStart"/>
-      <w:r>
-        <w:t xml:space="preserve">{{ </w:t>
-      </w:r>
-      <w:proofErr w:type="spellStart"/>
-      <w:r>
-        <w:t>fix</w:t>
-      </w:r>
-      <w:proofErr w:type="gramEnd"/>
-      <w:r>
-        <w:t>_punctuation</w:t>
-      </w:r>
-      <w:proofErr w:type="spellEnd"/>
-      <w:r>
-        <w:t>(line</w:t>
-      </w:r>
-      <w:proofErr w:type="gramStart"/>
-      <w:r>
-        <w:t>) }</w:t>
-      </w:r>
-      <w:proofErr w:type="gramEnd"/>
-      <w:r>
-        <w:t>}</w:t>
+      <w:r>
+        <w:t>{{ fix_punctuation(line) }}</w:t>
       </w:r>
     </w:p>
     <w:p>
@@ -1493,15 +823,7 @@
         <w:ind w:left="360"/>
       </w:pPr>
       <w:r>
-        <w:t xml:space="preserve">{%p </w:t>
-      </w:r>
-      <w:proofErr w:type="spellStart"/>
-      <w:r>
-        <w:t>endfor</w:t>
-      </w:r>
-      <w:proofErr w:type="spellEnd"/>
-      <w:r>
-        <w:t xml:space="preserve"> %}</w:t>
+        <w:t>{%p endfor %}</w:t>
       </w:r>
     </w:p>
     <w:p>
@@ -1546,13 +868,8 @@
       <w:r>
         <w:t xml:space="preserve">{%p if </w:t>
       </w:r>
-      <w:proofErr w:type="spellStart"/>
-      <w:r>
-        <w:t>al_next_steps_enabled</w:t>
-      </w:r>
-      <w:proofErr w:type="spellEnd"/>
-      <w:r>
-        <w:t xml:space="preserve"> %}</w:t>
+      <w:r>
+        <w:t>al_next_steps_enabled %}</w:t>
       </w:r>
     </w:p>
     <w:p>
@@ -1565,47 +882,11 @@
       <w:r>
         <w:t xml:space="preserve">Visit </w:t>
       </w:r>
-      <w:proofErr w:type="gramStart"/>
       <w:r>
         <w:rPr>
           <w:b/>
         </w:rPr>
-        <w:t xml:space="preserve">{{ </w:t>
-      </w:r>
-      <w:proofErr w:type="spellStart"/>
-      <w:r>
-        <w:rPr>
-          <w:b/>
-        </w:rPr>
-        <w:t>al</w:t>
-      </w:r>
-      <w:proofErr w:type="gramEnd"/>
-      <w:r>
-        <w:rPr>
-          <w:b/>
-        </w:rPr>
-        <w:t>_next_steps_help_</w:t>
-      </w:r>
-      <w:proofErr w:type="gramStart"/>
-      <w:r>
-        <w:rPr>
-          <w:b/>
-        </w:rPr>
-        <w:t>url</w:t>
-      </w:r>
-      <w:proofErr w:type="spellEnd"/>
-      <w:r>
-        <w:rPr>
-          <w:b/>
-        </w:rPr>
-        <w:t xml:space="preserve"> }</w:t>
-      </w:r>
-      <w:proofErr w:type="gramEnd"/>
-      <w:r>
-        <w:rPr>
-          <w:b/>
-        </w:rPr>
-        <w:t>}</w:t>
+        <w:t>{{ al_next_steps_help_url }}</w:t>
       </w:r>
     </w:p>
     <w:p>
@@ -1628,15 +909,7 @@
         <w:t>p</w:t>
       </w:r>
       <w:r>
-        <w:t xml:space="preserve"> if </w:t>
-      </w:r>
-      <w:proofErr w:type="spellStart"/>
-      <w:r>
-        <w:t>al_next_steps_generate_qr_code</w:t>
-      </w:r>
-      <w:proofErr w:type="spellEnd"/>
-      <w:r>
-        <w:t xml:space="preserve"> %}</w:t>
+        <w:t xml:space="preserve"> if al_next_steps_generate_qr_code %}</w:t>
       </w:r>
     </w:p>
     <w:p>
@@ -1659,50 +932,13 @@
         <w:t>{p</w:t>
       </w:r>
       <w:r>
-        <w:t xml:space="preserve"> </w:t>
-      </w:r>
-      <w:proofErr w:type="spellStart"/>
-      <w:r>
-        <w:t>qr_</w:t>
-      </w:r>
-      <w:proofErr w:type="gramStart"/>
-      <w:r>
-        <w:t>code</w:t>
-      </w:r>
-      <w:proofErr w:type="spellEnd"/>
-      <w:r>
-        <w:t>(</w:t>
-      </w:r>
-      <w:proofErr w:type="spellStart"/>
-      <w:proofErr w:type="gramEnd"/>
-      <w:r>
-        <w:t>al_next_steps_help_url</w:t>
-      </w:r>
-      <w:proofErr w:type="spellEnd"/>
-      <w:r>
-        <w:t>, width</w:t>
-      </w:r>
-      <w:r>
-        <w:t xml:space="preserve">="1in", </w:t>
-      </w:r>
-      <w:proofErr w:type="spellStart"/>
-      <w:r>
-        <w:t>alt_text</w:t>
-      </w:r>
-      <w:proofErr w:type="spellEnd"/>
-      <w:r>
-        <w:t>="</w:t>
-      </w:r>
-      <w:proofErr w:type="spellStart"/>
-      <w:r>
-        <w:t>al_next</w:t>
-      </w:r>
-      <w:r>
-        <w:t>_steps_help_url</w:t>
-      </w:r>
-      <w:proofErr w:type="spellEnd"/>
-      <w:r>
-        <w:t>") | markdown</w:t>
+        <w:t xml:space="preserve"> qr_code(al_next_steps_help_url, width</w:t>
+      </w:r>
+      <w:r>
+        <w:t>="1in", alt_text="al_next</w:t>
+      </w:r>
+      <w:r>
+        <w:t>_steps_help_url") | markdown</w:t>
       </w:r>
       <w:r>
         <w:t>}</w:t>
@@ -1732,7 +968,7 @@
 </file>
 
 <file path=word/endnotes.xml><?xml version="1.0" encoding="utf-8"?>
-<w:endnotes xmlns:wpc="http://schemas.microsoft.com/office/word/2010/wordprocessingCanvas" xmlns:cx="http://schemas.microsoft.com/office/drawing/2014/chartex" xmlns:cx1="http://schemas.microsoft.com/office/drawing/2015/9/8/chartex" xmlns:cx2="http://schemas.microsoft.com/office/drawing/2015/10/21/chartex" xmlns:cx3="http://schemas.microsoft.com/office/drawing/2016/5/9/chartex" xmlns:cx4="http://schemas.microsoft.com/office/drawing/2016/5/10/chartex" xmlns:cx5="http://schemas.microsoft.com/office/drawing/2016/5/11/chartex" xmlns:cx6="http://schemas.microsoft.com/office/drawing/2016/5/12/chartex" xmlns:cx7="http://schemas.microsoft.com/office/drawing/2016/5/13/chartex" xmlns:cx8="http://schemas.microsoft.com/office/drawing/2016/5/14/chartex" xmlns:mc="http://schemas.openxmlformats.org/markup-compatibility/2006" xmlns:m="http://schemas.openxmlformats.org/officeDocument/2006/math" xmlns:aink="http://schemas.microsoft.com/office/drawing/2016/ink" xmlns:am3d="http://schemas.microsoft.com/office/drawing/2017/model3d" xmlns:oel="http://schemas.microsoft.com/office/2019/extlst" xmlns:r="http://schemas.openxmlformats.org/officeDocument/2006/relationships" xmlns:wp14="http://schemas.microsoft.com/office/word/2010/wordprocessingDrawing" xmlns:wp="http://schemas.openxmlformats.org/drawingml/2006/wordprocessingDrawing" xmlns:wpg="http://schemas.microsoft.com/office/word/2010/wordprocessingGroup" xmlns:wpi="http://schemas.microsoft.com/office/word/2010/wordprocessingInk" xmlns:wps="http://schemas.microsoft.com/office/word/2010/wordprocessingShape" xmlns:o="urn:schemas-microsoft-com:office:office" xmlns:v="urn:schemas-microsoft-com:vml" xmlns:w10="urn:schemas-microsoft-com:office:word" xmlns:w="http://schemas.openxmlformats.org/wordprocessingml/2006/main" xmlns:w14="http://schemas.microsoft.com/office/word/2010/wordml" xmlns:w15="http://schemas.microsoft.com/office/word/2012/wordml" xmlns:w16cex="http://schemas.microsoft.com/office/word/2018/wordml/cex" xmlns:w16cid="http://schemas.microsoft.com/office/word/2016/wordml/cid" xmlns:w16="http://schemas.microsoft.com/office/word/2018/wordml" xmlns:w16sdtdh="http://schemas.microsoft.com/office/word/2020/wordml/sdtdatahash" xmlns:w16sdtfl="http://schemas.microsoft.com/office/word/2024/wordml/sdtformatlock" xmlns:w16se="http://schemas.microsoft.com/office/word/2015/wordml/symex" xmlns:w16du="http://schemas.microsoft.com/office/word/2023/wordml/word16du" xmlns:wne="http://schemas.microsoft.com/office/word/2006/wordml" mc:Ignorable="w14 w15 w16se w16cid w16 w16cex w16sdtdh w16sdtfl w16du wp14">
+<w:endnotes xmlns:wpc="http://schemas.microsoft.com/office/word/2010/wordprocessingCanvas" xmlns:cx="http://schemas.microsoft.com/office/drawing/2014/chartex" xmlns:cx1="http://schemas.microsoft.com/office/drawing/2015/9/8/chartex" xmlns:cx2="http://schemas.microsoft.com/office/drawing/2015/10/21/chartex" xmlns:cx3="http://schemas.microsoft.com/office/drawing/2016/5/9/chartex" xmlns:cx4="http://schemas.microsoft.com/office/drawing/2016/5/10/chartex" xmlns:cx5="http://schemas.microsoft.com/office/drawing/2016/5/11/chartex" xmlns:cx6="http://schemas.microsoft.com/office/drawing/2016/5/12/chartex" xmlns:cx7="http://schemas.microsoft.com/office/drawing/2016/5/13/chartex" xmlns:cx8="http://schemas.microsoft.com/office/drawing/2016/5/14/chartex" xmlns:mc="http://schemas.openxmlformats.org/markup-compatibility/2006" xmlns:aink="http://schemas.microsoft.com/office/drawing/2016/ink" xmlns:am3d="http://schemas.microsoft.com/office/drawing/2017/model3d" xmlns:o="urn:schemas-microsoft-com:office:office" xmlns:r="http://schemas.openxmlformats.org/officeDocument/2006/relationships" xmlns:m="http://schemas.openxmlformats.org/officeDocument/2006/math" xmlns:v="urn:schemas-microsoft-com:vml" xmlns:wp14="http://schemas.microsoft.com/office/word/2010/wordprocessingDrawing" xmlns:wp="http://schemas.openxmlformats.org/drawingml/2006/wordprocessingDrawing" xmlns:w10="urn:schemas-microsoft-com:office:word" xmlns:w="http://schemas.openxmlformats.org/wordprocessingml/2006/main" xmlns:w14="http://schemas.microsoft.com/office/word/2010/wordml" xmlns:w15="http://schemas.microsoft.com/office/word/2012/wordml" xmlns:w16cex="http://schemas.microsoft.com/office/word/2018/wordml/cex" xmlns:w16cid="http://schemas.microsoft.com/office/word/2016/wordml/cid" xmlns:w16="http://schemas.microsoft.com/office/word/2018/wordml" xmlns:w16sdtdh="http://schemas.microsoft.com/office/word/2020/wordml/sdtdatahash" xmlns:w16se="http://schemas.microsoft.com/office/word/2015/wordml/symex" xmlns:wpg="http://schemas.microsoft.com/office/word/2010/wordprocessingGroup" xmlns:wpi="http://schemas.microsoft.com/office/word/2010/wordprocessingInk" xmlns:wne="http://schemas.microsoft.com/office/word/2006/wordml" xmlns:wps="http://schemas.microsoft.com/office/word/2010/wordprocessingShape" mc:Ignorable="w14 w15 w16se w16cid w16 w16cex w16sdtdh wp14">
   <w:endnote w:type="separator" w:id="-1">
     <w:p>
       <w:pPr>
@@ -1757,7 +993,7 @@
 </file>
 
 <file path=word/footer1.xml><?xml version="1.0" encoding="utf-8"?>
-<w:ftr xmlns:wpc="http://schemas.microsoft.com/office/word/2010/wordprocessingCanvas" xmlns:cx="http://schemas.microsoft.com/office/drawing/2014/chartex" xmlns:cx1="http://schemas.microsoft.com/office/drawing/2015/9/8/chartex" xmlns:cx2="http://schemas.microsoft.com/office/drawing/2015/10/21/chartex" xmlns:cx3="http://schemas.microsoft.com/office/drawing/2016/5/9/chartex" xmlns:cx4="http://schemas.microsoft.com/office/drawing/2016/5/10/chartex" xmlns:cx5="http://schemas.microsoft.com/office/drawing/2016/5/11/chartex" xmlns:cx6="http://schemas.microsoft.com/office/drawing/2016/5/12/chartex" xmlns:cx7="http://schemas.microsoft.com/office/drawing/2016/5/13/chartex" xmlns:cx8="http://schemas.microsoft.com/office/drawing/2016/5/14/chartex" xmlns:mc="http://schemas.openxmlformats.org/markup-compatibility/2006" xmlns:m="http://schemas.openxmlformats.org/officeDocument/2006/math" xmlns:aink="http://schemas.microsoft.com/office/drawing/2016/ink" xmlns:am3d="http://schemas.microsoft.com/office/drawing/2017/model3d" xmlns:oel="http://schemas.microsoft.com/office/2019/extlst" xmlns:r="http://schemas.openxmlformats.org/officeDocument/2006/relationships" xmlns:wp14="http://schemas.microsoft.com/office/word/2010/wordprocessingDrawing" xmlns:wp="http://schemas.openxmlformats.org/drawingml/2006/wordprocessingDrawing" xmlns:wpg="http://schemas.microsoft.com/office/word/2010/wordprocessingGroup" xmlns:wpi="http://schemas.microsoft.com/office/word/2010/wordprocessingInk" xmlns:wps="http://schemas.microsoft.com/office/word/2010/wordprocessingShape" xmlns:o="urn:schemas-microsoft-com:office:office" xmlns:v="urn:schemas-microsoft-com:vml" xmlns:w10="urn:schemas-microsoft-com:office:word" xmlns:w="http://schemas.openxmlformats.org/wordprocessingml/2006/main" xmlns:w14="http://schemas.microsoft.com/office/word/2010/wordml" xmlns:w15="http://schemas.microsoft.com/office/word/2012/wordml" xmlns:w16cex="http://schemas.microsoft.com/office/word/2018/wordml/cex" xmlns:w16cid="http://schemas.microsoft.com/office/word/2016/wordml/cid" xmlns:w16="http://schemas.microsoft.com/office/word/2018/wordml" xmlns:w16sdtdh="http://schemas.microsoft.com/office/word/2020/wordml/sdtdatahash" xmlns:w16sdtfl="http://schemas.microsoft.com/office/word/2024/wordml/sdtformatlock" xmlns:w16se="http://schemas.microsoft.com/office/word/2015/wordml/symex" xmlns:w16du="http://schemas.microsoft.com/office/word/2023/wordml/word16du" xmlns:wne="http://schemas.microsoft.com/office/word/2006/wordml" mc:Ignorable="w14 w15 w16se w16cid w16 w16cex w16sdtdh w16sdtfl w16du wp14">
+<w:ftr xmlns:wpc="http://schemas.microsoft.com/office/word/2010/wordprocessingCanvas" xmlns:cx="http://schemas.microsoft.com/office/drawing/2014/chartex" xmlns:cx1="http://schemas.microsoft.com/office/drawing/2015/9/8/chartex" xmlns:cx2="http://schemas.microsoft.com/office/drawing/2015/10/21/chartex" xmlns:cx3="http://schemas.microsoft.com/office/drawing/2016/5/9/chartex" xmlns:cx4="http://schemas.microsoft.com/office/drawing/2016/5/10/chartex" xmlns:cx5="http://schemas.microsoft.com/office/drawing/2016/5/11/chartex" xmlns:cx6="http://schemas.microsoft.com/office/drawing/2016/5/12/chartex" xmlns:cx7="http://schemas.microsoft.com/office/drawing/2016/5/13/chartex" xmlns:cx8="http://schemas.microsoft.com/office/drawing/2016/5/14/chartex" xmlns:mc="http://schemas.openxmlformats.org/markup-compatibility/2006" xmlns:aink="http://schemas.microsoft.com/office/drawing/2016/ink" xmlns:am3d="http://schemas.microsoft.com/office/drawing/2017/model3d" xmlns:o="urn:schemas-microsoft-com:office:office" xmlns:r="http://schemas.openxmlformats.org/officeDocument/2006/relationships" xmlns:m="http://schemas.openxmlformats.org/officeDocument/2006/math" xmlns:v="urn:schemas-microsoft-com:vml" xmlns:wp14="http://schemas.microsoft.com/office/word/2010/wordprocessingDrawing" xmlns:wp="http://schemas.openxmlformats.org/drawingml/2006/wordprocessingDrawing" xmlns:w10="urn:schemas-microsoft-com:office:word" xmlns:w="http://schemas.openxmlformats.org/wordprocessingml/2006/main" xmlns:w14="http://schemas.microsoft.com/office/word/2010/wordml" xmlns:w15="http://schemas.microsoft.com/office/word/2012/wordml" xmlns:w16cex="http://schemas.microsoft.com/office/word/2018/wordml/cex" xmlns:w16cid="http://schemas.microsoft.com/office/word/2016/wordml/cid" xmlns:w16="http://schemas.microsoft.com/office/word/2018/wordml" xmlns:w16sdtdh="http://schemas.microsoft.com/office/word/2020/wordml/sdtdatahash" xmlns:w16se="http://schemas.microsoft.com/office/word/2015/wordml/symex" xmlns:wpg="http://schemas.microsoft.com/office/word/2010/wordprocessingGroup" xmlns:wpi="http://schemas.microsoft.com/office/word/2010/wordprocessingInk" xmlns:wne="http://schemas.microsoft.com/office/word/2006/wordml" xmlns:wps="http://schemas.microsoft.com/office/word/2010/wordprocessingShape" mc:Ignorable="w14 w15 w16se w16cid w16 w16cex w16sdtdh wp14">
   <w:p>
     <w:pPr>
       <w:pStyle w:val="Footer"/>
@@ -1834,25 +1070,7 @@
                               <w:color w:val="000000" w:themeColor="text1"/>
                               <w:sz w:val="22"/>
                             </w:rPr>
-                            <w:t xml:space="preserve">Find out more about what to </w:t>
-                          </w:r>
-                          <w:proofErr w:type="gramStart"/>
-                          <w:r>
-                            <w:rPr>
-                              <w:rFonts w:ascii="Arial" w:hAnsi="Arial" w:cs="Arial"/>
-                              <w:color w:val="000000" w:themeColor="text1"/>
-                              <w:sz w:val="22"/>
-                            </w:rPr>
-                            <w:t>do :</w:t>
-                          </w:r>
-                          <w:proofErr w:type="gramEnd"/>
-                          <w:r>
-                            <w:rPr>
-                              <w:rFonts w:ascii="Arial" w:hAnsi="Arial" w:cs="Arial"/>
-                              <w:color w:val="000000" w:themeColor="text1"/>
-                              <w:sz w:val="22"/>
-                            </w:rPr>
-                            <w:t xml:space="preserve"> </w:t>
+                            <w:t xml:space="preserve">Find out more about what to do : </w:t>
                           </w:r>
                         </w:p>
                         <w:p/>
@@ -1872,7 +1090,7 @@
         </mc:Choice>
         <mc:Fallback>
           <w:pict>
-            <v:roundrect w14:anchorId="06C0F375" id="Rounded Rectangle 6" o:spid="_x0000_s1026" style="width:539.8pt;height:63.5pt;visibility:visible;mso-wrap-style:square;mso-left-percent:-10001;mso-top-percent:-10001;mso-position-horizontal:absolute;mso-position-horizontal-relative:char;mso-position-vertical:absolute;mso-position-vertical-relative:line;mso-left-percent:-10001;mso-top-percent:-10001;v-text-anchor:middle" arcsize="10923f" o:gfxdata="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" fillcolor="#f2f2f2 [3052]" strokecolor="#bfbfbf [2412]" strokeweight=".18mm">
+            <v:roundrect w14:anchorId="06C0F375" id="Rounded Rectangle 6" o:spid="_x0000_s1026" style="width:539.8pt;height:63.5pt;visibility:visible;mso-wrap-style:square;mso-left-percent:-10001;mso-top-percent:-10001;mso-position-horizontal:absolute;mso-position-horizontal-relative:char;mso-position-vertical:absolute;mso-position-vertical-relative:line;mso-left-percent:-10001;mso-top-percent:-10001;v-text-anchor:middle" arcsize="10923f" o:gfxdata="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" fillcolor="#f2f2f2 [3052]" strokecolor="#bfbfbf [2412]" strokeweight=".18mm">
               <v:stroke joinstyle="miter"/>
               <v:textbox inset="14.4pt,14.4pt,14.4pt,14.4pt">
                 <w:txbxContent>
@@ -1890,25 +1108,7 @@
                         <w:color w:val="000000" w:themeColor="text1"/>
                         <w:sz w:val="22"/>
                       </w:rPr>
-                      <w:t xml:space="preserve">Find out more about what to </w:t>
-                    </w:r>
-                    <w:proofErr w:type="gramStart"/>
-                    <w:r>
-                      <w:rPr>
-                        <w:rFonts w:ascii="Arial" w:hAnsi="Arial" w:cs="Arial"/>
-                        <w:color w:val="000000" w:themeColor="text1"/>
-                        <w:sz w:val="22"/>
-                      </w:rPr>
-                      <w:t>do :</w:t>
-                    </w:r>
-                    <w:proofErr w:type="gramEnd"/>
-                    <w:r>
-                      <w:rPr>
-                        <w:rFonts w:ascii="Arial" w:hAnsi="Arial" w:cs="Arial"/>
-                        <w:color w:val="000000" w:themeColor="text1"/>
-                        <w:sz w:val="22"/>
-                      </w:rPr>
-                      <w:t xml:space="preserve"> </w:t>
+                      <w:t xml:space="preserve">Find out more about what to do : </w:t>
                     </w:r>
                   </w:p>
                   <w:p/>
@@ -1925,7 +1125,7 @@
 </file>
 
 <file path=word/footnotes.xml><?xml version="1.0" encoding="utf-8"?>
-<w:footnotes xmlns:wpc="http://schemas.microsoft.com/office/word/2010/wordprocessingCanvas" xmlns:cx="http://schemas.microsoft.com/office/drawing/2014/chartex" xmlns:cx1="http://schemas.microsoft.com/office/drawing/2015/9/8/chartex" xmlns:cx2="http://schemas.microsoft.com/office/drawing/2015/10/21/chartex" xmlns:cx3="http://schemas.microsoft.com/office/drawing/2016/5/9/chartex" xmlns:cx4="http://schemas.microsoft.com/office/drawing/2016/5/10/chartex" xmlns:cx5="http://schemas.microsoft.com/office/drawing/2016/5/11/chartex" xmlns:cx6="http://schemas.microsoft.com/office/drawing/2016/5/12/chartex" xmlns:cx7="http://schemas.microsoft.com/office/drawing/2016/5/13/chartex" xmlns:cx8="http://schemas.microsoft.com/office/drawing/2016/5/14/chartex" xmlns:mc="http://schemas.openxmlformats.org/markup-compatibility/2006" xmlns:m="http://schemas.openxmlformats.org/officeDocument/2006/math" xmlns:aink="http://schemas.microsoft.com/office/drawing/2016/ink" xmlns:am3d="http://schemas.microsoft.com/office/drawing/2017/model3d" xmlns:oel="http://schemas.microsoft.com/office/2019/extlst" xmlns:r="http://schemas.openxmlformats.org/officeDocument/2006/relationships" xmlns:wp14="http://schemas.microsoft.com/office/word/2010/wordprocessingDrawing" xmlns:wp="http://schemas.openxmlformats.org/drawingml/2006/wordprocessingDrawing" xmlns:wpg="http://schemas.microsoft.com/office/word/2010/wordprocessingGroup" xmlns:wpi="http://schemas.microsoft.com/office/word/2010/wordprocessingInk" xmlns:wps="http://schemas.microsoft.com/office/word/2010/wordprocessingShape" xmlns:o="urn:schemas-microsoft-com:office:office" xmlns:v="urn:schemas-microsoft-com:vml" xmlns:w10="urn:schemas-microsoft-com:office:word" xmlns:w="http://schemas.openxmlformats.org/wordprocessingml/2006/main" xmlns:w14="http://schemas.microsoft.com/office/word/2010/wordml" xmlns:w15="http://schemas.microsoft.com/office/word/2012/wordml" xmlns:w16cex="http://schemas.microsoft.com/office/word/2018/wordml/cex" xmlns:w16cid="http://schemas.microsoft.com/office/word/2016/wordml/cid" xmlns:w16="http://schemas.microsoft.com/office/word/2018/wordml" xmlns:w16sdtdh="http://schemas.microsoft.com/office/word/2020/wordml/sdtdatahash" xmlns:w16sdtfl="http://schemas.microsoft.com/office/word/2024/wordml/sdtformatlock" xmlns:w16se="http://schemas.microsoft.com/office/word/2015/wordml/symex" xmlns:w16du="http://schemas.microsoft.com/office/word/2023/wordml/word16du" xmlns:wne="http://schemas.microsoft.com/office/word/2006/wordml" mc:Ignorable="w14 w15 w16se w16cid w16 w16cex w16sdtdh w16sdtfl w16du wp14">
+<w:footnotes xmlns:wpc="http://schemas.microsoft.com/office/word/2010/wordprocessingCanvas" xmlns:cx="http://schemas.microsoft.com/office/drawing/2014/chartex" xmlns:cx1="http://schemas.microsoft.com/office/drawing/2015/9/8/chartex" xmlns:cx2="http://schemas.microsoft.com/office/drawing/2015/10/21/chartex" xmlns:cx3="http://schemas.microsoft.com/office/drawing/2016/5/9/chartex" xmlns:cx4="http://schemas.microsoft.com/office/drawing/2016/5/10/chartex" xmlns:cx5="http://schemas.microsoft.com/office/drawing/2016/5/11/chartex" xmlns:cx6="http://schemas.microsoft.com/office/drawing/2016/5/12/chartex" xmlns:cx7="http://schemas.microsoft.com/office/drawing/2016/5/13/chartex" xmlns:cx8="http://schemas.microsoft.com/office/drawing/2016/5/14/chartex" xmlns:mc="http://schemas.openxmlformats.org/markup-compatibility/2006" xmlns:aink="http://schemas.microsoft.com/office/drawing/2016/ink" xmlns:am3d="http://schemas.microsoft.com/office/drawing/2017/model3d" xmlns:o="urn:schemas-microsoft-com:office:office" xmlns:r="http://schemas.openxmlformats.org/officeDocument/2006/relationships" xmlns:m="http://schemas.openxmlformats.org/officeDocument/2006/math" xmlns:v="urn:schemas-microsoft-com:vml" xmlns:wp14="http://schemas.microsoft.com/office/word/2010/wordprocessingDrawing" xmlns:wp="http://schemas.openxmlformats.org/drawingml/2006/wordprocessingDrawing" xmlns:w10="urn:schemas-microsoft-com:office:word" xmlns:w="http://schemas.openxmlformats.org/wordprocessingml/2006/main" xmlns:w14="http://schemas.microsoft.com/office/word/2010/wordml" xmlns:w15="http://schemas.microsoft.com/office/word/2012/wordml" xmlns:w16cex="http://schemas.microsoft.com/office/word/2018/wordml/cex" xmlns:w16cid="http://schemas.microsoft.com/office/word/2016/wordml/cid" xmlns:w16="http://schemas.microsoft.com/office/word/2018/wordml" xmlns:w16sdtdh="http://schemas.microsoft.com/office/word/2020/wordml/sdtdatahash" xmlns:w16se="http://schemas.microsoft.com/office/word/2015/wordml/symex" xmlns:wpg="http://schemas.microsoft.com/office/word/2010/wordprocessingGroup" xmlns:wpi="http://schemas.microsoft.com/office/word/2010/wordprocessingInk" xmlns:wne="http://schemas.microsoft.com/office/word/2006/wordml" xmlns:wps="http://schemas.microsoft.com/office/word/2010/wordprocessingShape" mc:Ignorable="w14 w15 w16se w16cid w16 w16cex w16sdtdh wp14">
   <w:footnote w:type="separator" w:id="-1">
     <w:p>
       <w:pPr>
@@ -1950,7 +1150,7 @@
 </file>
 
 <file path=word/numbering.xml><?xml version="1.0" encoding="utf-8"?>
-<w:numbering xmlns:wpc="http://schemas.microsoft.com/office/word/2010/wordprocessingCanvas" xmlns:cx="http://schemas.microsoft.com/office/drawing/2014/chartex" xmlns:cx1="http://schemas.microsoft.com/office/drawing/2015/9/8/chartex" xmlns:cx2="http://schemas.microsoft.com/office/drawing/2015/10/21/chartex" xmlns:cx3="http://schemas.microsoft.com/office/drawing/2016/5/9/chartex" xmlns:cx4="http://schemas.microsoft.com/office/drawing/2016/5/10/chartex" xmlns:cx5="http://schemas.microsoft.com/office/drawing/2016/5/11/chartex" xmlns:cx6="http://schemas.microsoft.com/office/drawing/2016/5/12/chartex" xmlns:cx7="http://schemas.microsoft.com/office/drawing/2016/5/13/chartex" xmlns:cx8="http://schemas.microsoft.com/office/drawing/2016/5/14/chartex" xmlns:mc="http://schemas.openxmlformats.org/markup-compatibility/2006" xmlns:m="http://schemas.openxmlformats.org/officeDocument/2006/math" xmlns:aink="http://schemas.microsoft.com/office/drawing/2016/ink" xmlns:am3d="http://schemas.microsoft.com/office/drawing/2017/model3d" xmlns:oel="http://schemas.microsoft.com/office/2019/extlst" xmlns:r="http://schemas.openxmlformats.org/officeDocument/2006/relationships" xmlns:wp14="http://schemas.microsoft.com/office/word/2010/wordprocessingDrawing" xmlns:wp="http://schemas.openxmlformats.org/drawingml/2006/wordprocessingDrawing" xmlns:wpg="http://schemas.microsoft.com/office/word/2010/wordprocessingGroup" xmlns:wpi="http://schemas.microsoft.com/office/word/2010/wordprocessingInk" xmlns:wps="http://schemas.microsoft.com/office/word/2010/wordprocessingShape" xmlns:o="urn:schemas-microsoft-com:office:office" xmlns:v="urn:schemas-microsoft-com:vml" xmlns:w10="urn:schemas-microsoft-com:office:word" xmlns:w="http://schemas.openxmlformats.org/wordprocessingml/2006/main" xmlns:w14="http://schemas.microsoft.com/office/word/2010/wordml" xmlns:w15="http://schemas.microsoft.com/office/word/2012/wordml" xmlns:w16cex="http://schemas.microsoft.com/office/word/2018/wordml/cex" xmlns:w16cid="http://schemas.microsoft.com/office/word/2016/wordml/cid" xmlns:w16="http://schemas.microsoft.com/office/word/2018/wordml" xmlns:w16sdtdh="http://schemas.microsoft.com/office/word/2020/wordml/sdtdatahash" xmlns:w16sdtfl="http://schemas.microsoft.com/office/word/2024/wordml/sdtformatlock" xmlns:w16se="http://schemas.microsoft.com/office/word/2015/wordml/symex" xmlns:w16du="http://schemas.microsoft.com/office/word/2023/wordml/word16du" xmlns:wne="http://schemas.microsoft.com/office/word/2006/wordml" mc:Ignorable="w14 w15 w16se w16cid w16 w16cex w16sdtdh w16sdtfl w16du wp14">
+<w:numbering xmlns:wpc="http://schemas.microsoft.com/office/word/2010/wordprocessingCanvas" xmlns:cx="http://schemas.microsoft.com/office/drawing/2014/chartex" xmlns:cx1="http://schemas.microsoft.com/office/drawing/2015/9/8/chartex" xmlns:cx2="http://schemas.microsoft.com/office/drawing/2015/10/21/chartex" xmlns:cx3="http://schemas.microsoft.com/office/drawing/2016/5/9/chartex" xmlns:cx4="http://schemas.microsoft.com/office/drawing/2016/5/10/chartex" xmlns:cx5="http://schemas.microsoft.com/office/drawing/2016/5/11/chartex" xmlns:cx6="http://schemas.microsoft.com/office/drawing/2016/5/12/chartex" xmlns:cx7="http://schemas.microsoft.com/office/drawing/2016/5/13/chartex" xmlns:cx8="http://schemas.microsoft.com/office/drawing/2016/5/14/chartex" xmlns:mc="http://schemas.openxmlformats.org/markup-compatibility/2006" xmlns:aink="http://schemas.microsoft.com/office/drawing/2016/ink" xmlns:am3d="http://schemas.microsoft.com/office/drawing/2017/model3d" xmlns:o="urn:schemas-microsoft-com:office:office" xmlns:r="http://schemas.openxmlformats.org/officeDocument/2006/relationships" xmlns:m="http://schemas.openxmlformats.org/officeDocument/2006/math" xmlns:v="urn:schemas-microsoft-com:vml" xmlns:wp14="http://schemas.microsoft.com/office/word/2010/wordprocessingDrawing" xmlns:wp="http://schemas.openxmlformats.org/drawingml/2006/wordprocessingDrawing" xmlns:w10="urn:schemas-microsoft-com:office:word" xmlns:w="http://schemas.openxmlformats.org/wordprocessingml/2006/main" xmlns:w14="http://schemas.microsoft.com/office/word/2010/wordml" xmlns:w15="http://schemas.microsoft.com/office/word/2012/wordml" xmlns:w16cex="http://schemas.microsoft.com/office/word/2018/wordml/cex" xmlns:w16cid="http://schemas.microsoft.com/office/word/2016/wordml/cid" xmlns:w16="http://schemas.microsoft.com/office/word/2018/wordml" xmlns:w16sdtdh="http://schemas.microsoft.com/office/word/2020/wordml/sdtdatahash" xmlns:w16se="http://schemas.microsoft.com/office/word/2015/wordml/symex" xmlns:wpg="http://schemas.microsoft.com/office/word/2010/wordprocessingGroup" xmlns:wpi="http://schemas.microsoft.com/office/word/2010/wordprocessingInk" xmlns:wne="http://schemas.microsoft.com/office/word/2006/wordml" xmlns:wps="http://schemas.microsoft.com/office/word/2010/wordprocessingShape" mc:Ignorable="w14 w15 w16se w16cid w16 w16cex w16sdtdh wp14">
   <w:abstractNum w:abstractNumId="0" w15:restartNumberingAfterBreak="0">
     <w:nsid w:val="3FFE3326"/>
     <w:multiLevelType w:val="hybridMultilevel"/>
@@ -3100,41 +2300,41 @@
       </w:rPr>
     </w:lvl>
   </w:abstractNum>
-  <w:num w:numId="1" w16cid:durableId="1210730964">
+  <w:num w:numId="1">
     <w:abstractNumId w:val="9"/>
   </w:num>
-  <w:num w:numId="2" w16cid:durableId="913658898">
+  <w:num w:numId="2">
     <w:abstractNumId w:val="2"/>
   </w:num>
-  <w:num w:numId="3" w16cid:durableId="1539010627">
+  <w:num w:numId="3">
     <w:abstractNumId w:val="8"/>
   </w:num>
-  <w:num w:numId="4" w16cid:durableId="319965371">
+  <w:num w:numId="4">
     <w:abstractNumId w:val="7"/>
   </w:num>
-  <w:num w:numId="5" w16cid:durableId="1553421485">
+  <w:num w:numId="5">
     <w:abstractNumId w:val="4"/>
   </w:num>
-  <w:num w:numId="6" w16cid:durableId="1253394619">
+  <w:num w:numId="6">
     <w:abstractNumId w:val="1"/>
   </w:num>
-  <w:num w:numId="7" w16cid:durableId="317268038">
+  <w:num w:numId="7">
     <w:abstractNumId w:val="3"/>
   </w:num>
-  <w:num w:numId="8" w16cid:durableId="391466613">
+  <w:num w:numId="8">
     <w:abstractNumId w:val="6"/>
   </w:num>
-  <w:num w:numId="9" w16cid:durableId="1291324459">
+  <w:num w:numId="9">
     <w:abstractNumId w:val="0"/>
   </w:num>
-  <w:num w:numId="10" w16cid:durableId="131287368">
+  <w:num w:numId="10">
     <w:abstractNumId w:val="5"/>
   </w:num>
 </w:numbering>
 </file>
 
 <file path=word/styles.xml><?xml version="1.0" encoding="utf-8"?>
-<w:styles xmlns:mc="http://schemas.openxmlformats.org/markup-compatibility/2006" xmlns:r="http://schemas.openxmlformats.org/officeDocument/2006/relationships" xmlns:w="http://schemas.openxmlformats.org/wordprocessingml/2006/main" xmlns:w14="http://schemas.microsoft.com/office/word/2010/wordml" xmlns:w15="http://schemas.microsoft.com/office/word/2012/wordml" xmlns:w16cex="http://schemas.microsoft.com/office/word/2018/wordml/cex" xmlns:w16cid="http://schemas.microsoft.com/office/word/2016/wordml/cid" xmlns:w16="http://schemas.microsoft.com/office/word/2018/wordml" xmlns:w16sdtdh="http://schemas.microsoft.com/office/word/2020/wordml/sdtdatahash" xmlns:w16sdtfl="http://schemas.microsoft.com/office/word/2024/wordml/sdtformatlock" xmlns:w16se="http://schemas.microsoft.com/office/word/2015/wordml/symex" xmlns:w16du="http://schemas.microsoft.com/office/word/2023/wordml/word16du" mc:Ignorable="w14 w15 w16se w16cid w16 w16cex w16sdtdh w16sdtfl w16du">
+<w:styles xmlns:mc="http://schemas.openxmlformats.org/markup-compatibility/2006" xmlns:r="http://schemas.openxmlformats.org/officeDocument/2006/relationships" xmlns:w="http://schemas.openxmlformats.org/wordprocessingml/2006/main" xmlns:w14="http://schemas.microsoft.com/office/word/2010/wordml" xmlns:w15="http://schemas.microsoft.com/office/word/2012/wordml" xmlns:w16cex="http://schemas.microsoft.com/office/word/2018/wordml/cex" xmlns:w16cid="http://schemas.microsoft.com/office/word/2016/wordml/cid" xmlns:w16="http://schemas.microsoft.com/office/word/2018/wordml" xmlns:w16sdtdh="http://schemas.microsoft.com/office/word/2020/wordml/sdtdatahash" xmlns:w16se="http://schemas.microsoft.com/office/word/2015/wordml/symex" mc:Ignorable="w14 w15 w16se w16cid w16 w16cex w16sdtdh">
   <w:docDefaults>
     <w:rPrDefault>
       <w:rPr>
@@ -3256,7 +2456,6 @@
     <w:lsdException w:name="HTML Sample" w:semiHidden="1" w:unhideWhenUsed="1"/>
     <w:lsdException w:name="HTML Typewriter" w:semiHidden="1" w:unhideWhenUsed="1"/>
     <w:lsdException w:name="HTML Variable" w:semiHidden="1" w:unhideWhenUsed="1"/>
-    <w:lsdException w:name="Normal Table" w:semiHidden="1" w:unhideWhenUsed="1"/>
     <w:lsdException w:name="annotation subject" w:semiHidden="1" w:unhideWhenUsed="1"/>
     <w:lsdException w:name="No List" w:semiHidden="1" w:unhideWhenUsed="1"/>
     <w:lsdException w:name="Outline List 1" w:semiHidden="1" w:unhideWhenUsed="1"/>
@@ -3303,10 +2502,8 @@
     <w:lsdException w:name="Table Subtle 2" w:semiHidden="1" w:unhideWhenUsed="1"/>
     <w:lsdException w:name="Table Web 1" w:semiHidden="1" w:unhideWhenUsed="1"/>
     <w:lsdException w:name="Table Web 2" w:semiHidden="1" w:unhideWhenUsed="1"/>
-    <w:lsdException w:name="Table Web 3" w:semiHidden="1" w:unhideWhenUsed="1"/>
     <w:lsdException w:name="Balloon Text" w:semiHidden="1" w:unhideWhenUsed="1"/>
     <w:lsdException w:name="Table Grid" w:uiPriority="39"/>
-    <w:lsdException w:name="Table Theme" w:semiHidden="1" w:unhideWhenUsed="1"/>
     <w:lsdException w:name="Placeholder Text" w:semiHidden="1"/>
     <w:lsdException w:name="No Spacing" w:uiPriority="1" w:qFormat="1"/>
     <w:lsdException w:name="Light Shading" w:uiPriority="60"/>

</xml_diff>